<commit_message>
Updated Step 4 documents
</commit_message>
<xml_diff>
--- a/docs/Project step 3 draft.docx
+++ b/docs/Project step 3 draft.docx
@@ -22,19 +22,11 @@
       <w:pPr>
         <w:pStyle w:val="Body"/>
       </w:pPr>
-      <w:proofErr w:type="gramStart"/>
       <w:r>
         <w:rPr>
           <w:lang w:val="fr-FR"/>
         </w:rPr>
-        <w:t>Group:</w:t>
-      </w:r>
-      <w:proofErr w:type="gramEnd"/>
-      <w:r>
-        <w:rPr>
-          <w:lang w:val="fr-FR"/>
-        </w:rPr>
-        <w:t xml:space="preserve"> 80</w:t>
+        <w:t>Group: 80</w:t>
       </w:r>
     </w:p>
     <w:p>
@@ -50,18 +42,24 @@
         <w:pStyle w:val="Body"/>
       </w:pPr>
       <w:r>
-        <w:t>Project Step 3 Draft Version: Design UI Interface + DML SQL</w:t>
-      </w:r>
-    </w:p>
-    <w:p>
-      <w:pPr>
-        <w:pStyle w:val="Body"/>
-      </w:pPr>
-      <w:r>
-        <w:t>Date: 02/</w:t>
-      </w:r>
-      <w:r>
-        <w:t>12</w:t>
+        <w:t xml:space="preserve">Project Step </w:t>
+      </w:r>
+      <w:r>
+        <w:t>4 Draft</w:t>
+      </w:r>
+      <w:r>
+        <w:t xml:space="preserve"> Version</w:t>
+      </w:r>
+    </w:p>
+    <w:p>
+      <w:pPr>
+        <w:pStyle w:val="Body"/>
+      </w:pPr>
+      <w:r>
+        <w:t xml:space="preserve">Date: </w:t>
+      </w:r>
+      <w:r>
+        <w:t>03/02</w:t>
       </w:r>
       <w:r>
         <w:t>/2026</w:t>
@@ -161,832 +159,47 @@
         </w:rPr>
         <w:t xml:space="preserve"> Feedback from Step 3</w:t>
       </w:r>
-    </w:p>
-    <w:p>
-      <w:pPr>
-        <w:pStyle w:val="Body"/>
+      <w:r>
         <w:rPr>
           <w:b/>
           <w:bCs/>
           <w:sz w:val="30"/>
           <w:szCs w:val="30"/>
         </w:rPr>
-      </w:pPr>
-    </w:p>
-    <w:p>
-      <w:pPr>
-        <w:pBdr>
-          <w:top w:val="none" w:sz="0" w:space="0" w:color="auto"/>
-          <w:left w:val="none" w:sz="0" w:space="0" w:color="auto"/>
-          <w:bottom w:val="none" w:sz="0" w:space="0" w:color="auto"/>
-          <w:right w:val="none" w:sz="0" w:space="0" w:color="auto"/>
-          <w:between w:val="none" w:sz="0" w:space="0" w:color="auto"/>
-          <w:bar w:val="none" w:sz="0" w:color="auto"/>
-        </w:pBdr>
-        <w:rPr>
-          <w:rFonts w:eastAsia="Times New Roman"/>
-          <w:bdr w:val="none" w:sz="0" w:space="0" w:color="auto"/>
-        </w:rPr>
-      </w:pPr>
-      <w:r>
-        <w:rPr>
-          <w:rFonts w:eastAsia="Times New Roman"/>
-          <w:bdr w:val="none" w:sz="0" w:space="0" w:color="auto"/>
-        </w:rPr>
-        <w:t>Feedback by the peer reviewer:</w:t>
-      </w:r>
-      <w:r>
-        <w:rPr>
-          <w:rFonts w:eastAsia="Times New Roman"/>
-          <w:bdr w:val="none" w:sz="0" w:space="0" w:color="auto"/>
-        </w:rPr>
-        <w:br/>
-        <w:t>Thane Thompson</w:t>
-      </w:r>
-    </w:p>
-    <w:p>
-      <w:pPr>
-        <w:pBdr>
-          <w:top w:val="none" w:sz="0" w:space="0" w:color="auto"/>
-          <w:left w:val="none" w:sz="0" w:space="0" w:color="auto"/>
-          <w:bottom w:val="none" w:sz="0" w:space="0" w:color="auto"/>
-          <w:right w:val="none" w:sz="0" w:space="0" w:color="auto"/>
-          <w:between w:val="none" w:sz="0" w:space="0" w:color="auto"/>
-          <w:bar w:val="none" w:sz="0" w:color="auto"/>
-        </w:pBdr>
-        <w:rPr>
-          <w:rFonts w:eastAsia="Times New Roman"/>
-          <w:bdr w:val="none" w:sz="0" w:space="0" w:color="auto"/>
-        </w:rPr>
-      </w:pPr>
-      <w:r>
-        <w:rPr>
-          <w:rFonts w:eastAsia="Times New Roman"/>
-          <w:bdr w:val="none" w:sz="0" w:space="0" w:color="auto"/>
-        </w:rPr>
-        <w:br/>
-        <w:t>Group 80, My response in BOLD</w:t>
-      </w:r>
-      <w:r>
-        <w:rPr>
-          <w:rFonts w:eastAsia="Times New Roman"/>
-          <w:bdr w:val="none" w:sz="0" w:space="0" w:color="auto"/>
-        </w:rPr>
-        <w:br/>
-        <w:t>o A SELECT for every table in the schema? YES</w:t>
-      </w:r>
-      <w:r>
-        <w:rPr>
-          <w:rFonts w:eastAsia="Times New Roman"/>
-          <w:bdr w:val="none" w:sz="0" w:space="0" w:color="auto"/>
-        </w:rPr>
-        <w:br/>
-        <w:t>o Does the UI implement an INSERT form for at least one table in the schema? YES</w:t>
-      </w:r>
-      <w:r>
-        <w:rPr>
-          <w:rFonts w:eastAsia="Times New Roman"/>
-          <w:bdr w:val="none" w:sz="0" w:space="0" w:color="auto"/>
-        </w:rPr>
-        <w:br/>
-        <w:t>o Does the UI have at least one DELETE for any one entity? DELETE APPEARS PRESENT ON THE UI,</w:t>
-      </w:r>
-      <w:r>
-        <w:rPr>
-          <w:rFonts w:eastAsia="Times New Roman"/>
-          <w:bdr w:val="none" w:sz="0" w:space="0" w:color="auto"/>
-        </w:rPr>
-        <w:br/>
-        <w:t>BUT IT DOES NOT DELETE RECORDS</w:t>
-      </w:r>
-      <w:r>
-        <w:rPr>
-          <w:rFonts w:eastAsia="Times New Roman"/>
-          <w:bdr w:val="none" w:sz="0" w:space="0" w:color="auto"/>
-        </w:rPr>
-        <w:br/>
-        <w:t>o Does the UI have at least one DELETE that will remove things from a M:M relationship? DELETE DOES</w:t>
-      </w:r>
-      <w:r>
-        <w:rPr>
-          <w:rFonts w:eastAsia="Times New Roman"/>
-          <w:bdr w:val="none" w:sz="0" w:space="0" w:color="auto"/>
-        </w:rPr>
-        <w:br/>
-        <w:t>NOT REMOVE THINGS</w:t>
-      </w:r>
-      <w:r>
-        <w:rPr>
-          <w:rFonts w:eastAsia="Times New Roman"/>
-          <w:bdr w:val="none" w:sz="0" w:space="0" w:color="auto"/>
-        </w:rPr>
-        <w:br/>
-        <w:t>o Is there at least one UPDATE form in the UI for any one entity? YES, IT WORKS ON CUSTOMER</w:t>
-      </w:r>
-      <w:r>
-        <w:rPr>
-          <w:rFonts w:eastAsia="Times New Roman"/>
-          <w:bdr w:val="none" w:sz="0" w:space="0" w:color="auto"/>
-        </w:rPr>
-        <w:br/>
-        <w:t xml:space="preserve">o Is there at least one UPDATE form in the UI to modify an M:M relationship? </w:t>
-      </w:r>
-      <w:proofErr w:type="gramStart"/>
-      <w:r>
-        <w:rPr>
-          <w:rFonts w:eastAsia="Times New Roman"/>
-          <w:bdr w:val="none" w:sz="0" w:space="0" w:color="auto"/>
-        </w:rPr>
-        <w:t>YES</w:t>
-      </w:r>
-      <w:proofErr w:type="gramEnd"/>
-      <w:r>
-        <w:rPr>
-          <w:rFonts w:eastAsia="Times New Roman"/>
-          <w:bdr w:val="none" w:sz="0" w:space="0" w:color="auto"/>
-        </w:rPr>
-        <w:t xml:space="preserve"> IS PRESENT ON UI,</w:t>
-      </w:r>
-      <w:r>
-        <w:rPr>
-          <w:rFonts w:eastAsia="Times New Roman"/>
-          <w:bdr w:val="none" w:sz="0" w:space="0" w:color="auto"/>
-        </w:rPr>
-        <w:br/>
-        <w:t>BUT DOES NOT WORK FOR RENTAL ORDER ITEMS</w:t>
-      </w:r>
-      <w:r>
-        <w:rPr>
-          <w:rFonts w:eastAsia="Times New Roman"/>
-          <w:bdr w:val="none" w:sz="0" w:space="0" w:color="auto"/>
-        </w:rPr>
-        <w:br/>
-        <w:t>o Do you have any other suggestions for the team to help with their HTML UI? EVENTUALLY, THE USER</w:t>
-      </w:r>
-      <w:r>
-        <w:rPr>
-          <w:rFonts w:eastAsia="Times New Roman"/>
-          <w:bdr w:val="none" w:sz="0" w:space="0" w:color="auto"/>
-        </w:rPr>
-        <w:br/>
-        <w:t>WILL NOT HAVE TO SELECT THE VARIOUS IDs TO UPDATE DATA</w:t>
-      </w:r>
-      <w:r>
-        <w:rPr>
-          <w:rFonts w:eastAsia="Times New Roman"/>
-          <w:bdr w:val="none" w:sz="0" w:space="0" w:color="auto"/>
-        </w:rPr>
-        <w:br/>
-        <w:t>o As a reviewer, clearly describe to what extent your feedback to the team was original (e.g. "all my work") or</w:t>
-      </w:r>
-      <w:r>
-        <w:rPr>
-          <w:rFonts w:eastAsia="Times New Roman"/>
-          <w:bdr w:val="none" w:sz="0" w:space="0" w:color="auto"/>
-        </w:rPr>
-        <w:br/>
-        <w:t>non-original ALL ME.</w:t>
-      </w:r>
-      <w:r>
-        <w:rPr>
-          <w:rFonts w:eastAsia="Times New Roman"/>
-          <w:bdr w:val="none" w:sz="0" w:space="0" w:color="auto"/>
-        </w:rPr>
-        <w:br/>
-        <w:t>Cadin Martin</w:t>
-      </w:r>
-      <w:r>
-        <w:rPr>
-          <w:rFonts w:eastAsia="Times New Roman"/>
-          <w:bdr w:val="none" w:sz="0" w:space="0" w:color="auto"/>
-        </w:rPr>
-        <w:br/>
-        <w:t>To start off, all the written work here is my own, I did not use any AI to assist in this review.</w:t>
-      </w:r>
-      <w:r>
-        <w:rPr>
-          <w:rFonts w:eastAsia="Times New Roman"/>
-          <w:bdr w:val="none" w:sz="0" w:space="0" w:color="auto"/>
-        </w:rPr>
-        <w:br/>
-        <w:t>I see the Select system is working, I can clearly see all of the inserted sample data; there's also a clear area for</w:t>
-      </w:r>
-      <w:r>
-        <w:rPr>
-          <w:rFonts w:eastAsia="Times New Roman"/>
-          <w:bdr w:val="none" w:sz="0" w:space="0" w:color="auto"/>
-        </w:rPr>
-        <w:br/>
-        <w:t>INSERT, DELETE, and UPDATE for all the pages, with pseudo-functionality looking ready to go.</w:t>
-      </w:r>
-      <w:r>
-        <w:rPr>
-          <w:rFonts w:eastAsia="Times New Roman"/>
-          <w:bdr w:val="none" w:sz="0" w:space="0" w:color="auto"/>
-        </w:rPr>
-        <w:br/>
-        <w:t>Overall, it looks well-done and well-crafted. If I were to suggest anything, it's stylistic rather than functional,</w:t>
-      </w:r>
-      <w:r>
-        <w:rPr>
-          <w:rFonts w:eastAsia="Times New Roman"/>
-          <w:bdr w:val="none" w:sz="0" w:space="0" w:color="auto"/>
-        </w:rPr>
-        <w:br/>
-        <w:t>moving into the Part 3 Final: Enlarging and centering some of the ADD/DELETE/UPDATE sections could</w:t>
-      </w:r>
-      <w:r>
-        <w:rPr>
-          <w:rFonts w:eastAsia="Times New Roman"/>
-          <w:bdr w:val="none" w:sz="0" w:space="0" w:color="auto"/>
-        </w:rPr>
-        <w:br/>
-      </w:r>
-      <w:r>
-        <w:rPr>
-          <w:rFonts w:eastAsia="Times New Roman"/>
-          <w:bdr w:val="none" w:sz="0" w:space="0" w:color="auto"/>
-        </w:rPr>
-        <w:lastRenderedPageBreak/>
-        <w:t>make it look more professional, and adding a link between each page to the other pages helps save time (Right</w:t>
-      </w:r>
-      <w:r>
-        <w:rPr>
-          <w:rFonts w:eastAsia="Times New Roman"/>
-          <w:bdr w:val="none" w:sz="0" w:space="0" w:color="auto"/>
-        </w:rPr>
-        <w:br/>
-        <w:t>now, I have to go back to the index to go to any of the other pages, which slows things down).</w:t>
-      </w:r>
-    </w:p>
-    <w:p>
-      <w:pPr>
-        <w:pBdr>
-          <w:top w:val="none" w:sz="0" w:space="0" w:color="auto"/>
-          <w:left w:val="none" w:sz="0" w:space="0" w:color="auto"/>
-          <w:bottom w:val="none" w:sz="0" w:space="0" w:color="auto"/>
-          <w:right w:val="none" w:sz="0" w:space="0" w:color="auto"/>
-          <w:between w:val="none" w:sz="0" w:space="0" w:color="auto"/>
-          <w:bar w:val="none" w:sz="0" w:color="auto"/>
-        </w:pBdr>
-        <w:rPr>
-          <w:rFonts w:eastAsia="Times New Roman"/>
-          <w:bdr w:val="none" w:sz="0" w:space="0" w:color="auto"/>
-        </w:rPr>
-      </w:pPr>
-    </w:p>
-    <w:p>
-      <w:pPr>
-        <w:pBdr>
-          <w:top w:val="none" w:sz="0" w:space="0" w:color="auto"/>
-          <w:left w:val="none" w:sz="0" w:space="0" w:color="auto"/>
-          <w:bottom w:val="none" w:sz="0" w:space="0" w:color="auto"/>
-          <w:right w:val="none" w:sz="0" w:space="0" w:color="auto"/>
-          <w:between w:val="none" w:sz="0" w:space="0" w:color="auto"/>
-          <w:bar w:val="none" w:sz="0" w:color="auto"/>
-        </w:pBdr>
-        <w:rPr>
-          <w:rFonts w:eastAsia="Times New Roman"/>
-          <w:bdr w:val="none" w:sz="0" w:space="0" w:color="auto"/>
-        </w:rPr>
-      </w:pPr>
-      <w:r>
-        <w:rPr>
-          <w:rFonts w:eastAsia="Times New Roman"/>
-          <w:bdr w:val="none" w:sz="0" w:space="0" w:color="auto"/>
-        </w:rPr>
-        <w:br/>
-        <w:t>Ethan Mark</w:t>
-      </w:r>
-      <w:r>
-        <w:rPr>
-          <w:rFonts w:eastAsia="Times New Roman"/>
-          <w:bdr w:val="none" w:sz="0" w:space="0" w:color="auto"/>
-        </w:rPr>
-        <w:br/>
-        <w:t>Does the UI utilize a SELECT for every table in the schema? In other words, data from each table in the schema</w:t>
-      </w:r>
-      <w:r>
-        <w:rPr>
-          <w:rFonts w:eastAsia="Times New Roman"/>
-          <w:bdr w:val="none" w:sz="0" w:space="0" w:color="auto"/>
-        </w:rPr>
-        <w:br/>
-        <w:t>should be displayed on the UI. Note: it is generally not acceptable for just a single query to join all tables and</w:t>
-      </w:r>
-      <w:r>
-        <w:rPr>
-          <w:rFonts w:eastAsia="Times New Roman"/>
-          <w:bdr w:val="none" w:sz="0" w:space="0" w:color="auto"/>
-        </w:rPr>
-        <w:br/>
-        <w:t>displays them.</w:t>
-      </w:r>
-      <w:r>
-        <w:rPr>
-          <w:rFonts w:eastAsia="Times New Roman"/>
-          <w:bdr w:val="none" w:sz="0" w:space="0" w:color="auto"/>
-        </w:rPr>
-        <w:br/>
-        <w:t>Yes, the UI has a select query for every table in the schema</w:t>
-      </w:r>
-      <w:r>
-        <w:rPr>
-          <w:rFonts w:eastAsia="Times New Roman"/>
-          <w:bdr w:val="none" w:sz="0" w:space="0" w:color="auto"/>
-        </w:rPr>
-        <w:br/>
-        <w:t>Does the UI implement an INSERT form for at least one table in the schema? In other words, there should be</w:t>
-      </w:r>
-      <w:r>
-        <w:rPr>
-          <w:rFonts w:eastAsia="Times New Roman"/>
-          <w:bdr w:val="none" w:sz="0" w:space="0" w:color="auto"/>
-        </w:rPr>
-        <w:br/>
-        <w:t>UI input fields that correspond to at least one table.</w:t>
-      </w:r>
-      <w:r>
-        <w:rPr>
-          <w:rFonts w:eastAsia="Times New Roman"/>
-          <w:bdr w:val="none" w:sz="0" w:space="0" w:color="auto"/>
-        </w:rPr>
-        <w:br/>
-        <w:t>Yes, each table has an INSERT form for each table</w:t>
-      </w:r>
-      <w:r>
-        <w:rPr>
-          <w:rFonts w:eastAsia="Times New Roman"/>
-          <w:bdr w:val="none" w:sz="0" w:space="0" w:color="auto"/>
-        </w:rPr>
-        <w:br/>
-        <w:t>Does the UI have at least one DELETE for any one entity? In other words, is there a form/link/button that will</w:t>
-      </w:r>
-      <w:r>
-        <w:rPr>
-          <w:rFonts w:eastAsia="Times New Roman"/>
-          <w:bdr w:val="none" w:sz="0" w:space="0" w:color="auto"/>
-        </w:rPr>
-        <w:br/>
-        <w:t>allow the deletion of a row in at least one table?</w:t>
-      </w:r>
-      <w:r>
-        <w:rPr>
-          <w:rFonts w:eastAsia="Times New Roman"/>
-          <w:bdr w:val="none" w:sz="0" w:space="0" w:color="auto"/>
-        </w:rPr>
-        <w:br/>
-        <w:t>Yes, each table has a DELETE for every entity</w:t>
-      </w:r>
-      <w:r>
-        <w:rPr>
-          <w:rFonts w:eastAsia="Times New Roman"/>
-          <w:bdr w:val="none" w:sz="0" w:space="0" w:color="auto"/>
-        </w:rPr>
-        <w:br/>
-        <w:t>Does the UI have at least one DELETE that will remove things from a M:M relationship? In other words, if an</w:t>
-      </w:r>
-      <w:r>
-        <w:rPr>
-          <w:rFonts w:eastAsia="Times New Roman"/>
-          <w:bdr w:val="none" w:sz="0" w:space="0" w:color="auto"/>
-        </w:rPr>
-        <w:br/>
-        <w:t xml:space="preserve">order is deleted from the Orders table, it should also delete the corresponding rows from the </w:t>
-      </w:r>
-      <w:proofErr w:type="spellStart"/>
-      <w:r>
-        <w:rPr>
-          <w:rFonts w:eastAsia="Times New Roman"/>
-          <w:bdr w:val="none" w:sz="0" w:space="0" w:color="auto"/>
-        </w:rPr>
-        <w:t>OrderDetails</w:t>
-      </w:r>
-      <w:proofErr w:type="spellEnd"/>
-      <w:r>
-        <w:rPr>
-          <w:rFonts w:eastAsia="Times New Roman"/>
-          <w:bdr w:val="none" w:sz="0" w:space="0" w:color="auto"/>
-        </w:rPr>
-        <w:t xml:space="preserve"> table,</w:t>
-      </w:r>
-      <w:r>
-        <w:rPr>
-          <w:rFonts w:eastAsia="Times New Roman"/>
-          <w:bdr w:val="none" w:sz="0" w:space="0" w:color="auto"/>
-        </w:rPr>
-        <w:br/>
-        <w:t>BUT it should not delete any Products or Customers.</w:t>
-      </w:r>
-      <w:r>
-        <w:rPr>
-          <w:rFonts w:eastAsia="Times New Roman"/>
-          <w:bdr w:val="none" w:sz="0" w:space="0" w:color="auto"/>
-        </w:rPr>
-        <w:br/>
-        <w:t>Yes, the UI has a DELETE form for M:M relationship between Gear items &amp; Rental Order Items</w:t>
-      </w:r>
-      <w:r>
-        <w:rPr>
-          <w:rFonts w:eastAsia="Times New Roman"/>
-          <w:bdr w:val="none" w:sz="0" w:space="0" w:color="auto"/>
-        </w:rPr>
-        <w:br/>
-        <w:t>Is there at least one UPDATE form in the UI for any one entity? In other words, in the case of Products, can</w:t>
-      </w:r>
-      <w:r>
-        <w:rPr>
-          <w:rFonts w:eastAsia="Times New Roman"/>
-          <w:bdr w:val="none" w:sz="0" w:space="0" w:color="auto"/>
-        </w:rPr>
-        <w:br/>
-      </w:r>
-      <w:proofErr w:type="spellStart"/>
-      <w:r>
-        <w:rPr>
-          <w:rFonts w:eastAsia="Times New Roman"/>
-          <w:bdr w:val="none" w:sz="0" w:space="0" w:color="auto"/>
-        </w:rPr>
-        <w:t>productName</w:t>
-      </w:r>
-      <w:proofErr w:type="spellEnd"/>
-      <w:r>
-        <w:rPr>
-          <w:rFonts w:eastAsia="Times New Roman"/>
-          <w:bdr w:val="none" w:sz="0" w:space="0" w:color="auto"/>
-        </w:rPr>
-        <w:t xml:space="preserve">, </w:t>
-      </w:r>
-      <w:proofErr w:type="spellStart"/>
-      <w:r>
-        <w:rPr>
-          <w:rFonts w:eastAsia="Times New Roman"/>
-          <w:bdr w:val="none" w:sz="0" w:space="0" w:color="auto"/>
-        </w:rPr>
-        <w:t>listPrice</w:t>
-      </w:r>
-      <w:proofErr w:type="spellEnd"/>
-      <w:r>
-        <w:rPr>
-          <w:rFonts w:eastAsia="Times New Roman"/>
-          <w:bdr w:val="none" w:sz="0" w:space="0" w:color="auto"/>
-        </w:rPr>
-        <w:t xml:space="preserve">, </w:t>
-      </w:r>
-      <w:proofErr w:type="spellStart"/>
-      <w:r>
-        <w:rPr>
-          <w:rFonts w:eastAsia="Times New Roman"/>
-          <w:bdr w:val="none" w:sz="0" w:space="0" w:color="auto"/>
-        </w:rPr>
-        <w:t>qtyOnHand</w:t>
-      </w:r>
-      <w:proofErr w:type="spellEnd"/>
-      <w:r>
-        <w:rPr>
-          <w:rFonts w:eastAsia="Times New Roman"/>
-          <w:bdr w:val="none" w:sz="0" w:space="0" w:color="auto"/>
-        </w:rPr>
-        <w:t xml:space="preserve">, e.g. be updated for a single </w:t>
-      </w:r>
-      <w:proofErr w:type="spellStart"/>
-      <w:r>
-        <w:rPr>
-          <w:rFonts w:eastAsia="Times New Roman"/>
-          <w:bdr w:val="none" w:sz="0" w:space="0" w:color="auto"/>
-        </w:rPr>
-        <w:t>ProductID</w:t>
-      </w:r>
-      <w:proofErr w:type="spellEnd"/>
-      <w:r>
-        <w:rPr>
-          <w:rFonts w:eastAsia="Times New Roman"/>
-          <w:bdr w:val="none" w:sz="0" w:space="0" w:color="auto"/>
-        </w:rPr>
-        <w:t xml:space="preserve"> record?</w:t>
-      </w:r>
-      <w:r>
-        <w:rPr>
-          <w:rFonts w:eastAsia="Times New Roman"/>
-          <w:bdr w:val="none" w:sz="0" w:space="0" w:color="auto"/>
-        </w:rPr>
-        <w:br/>
-        <w:t>Yes, each table has an UPDATE form to update records within the table</w:t>
-      </w:r>
-      <w:r>
-        <w:rPr>
-          <w:rFonts w:eastAsia="Times New Roman"/>
-          <w:bdr w:val="none" w:sz="0" w:space="0" w:color="auto"/>
-        </w:rPr>
-        <w:br/>
-        <w:t>Is there at least one UPDATE form in the UI to modify an M:M relationship? In other words, does the</w:t>
-      </w:r>
-      <w:r>
-        <w:rPr>
-          <w:rFonts w:eastAsia="Times New Roman"/>
-          <w:bdr w:val="none" w:sz="0" w:space="0" w:color="auto"/>
-        </w:rPr>
-        <w:br/>
-        <w:t>UPDATE allow the user to select a different foreign key value to update the intersection table with</w:t>
-      </w:r>
-      <w:r>
-        <w:rPr>
-          <w:rFonts w:eastAsia="Times New Roman"/>
-          <w:bdr w:val="none" w:sz="0" w:space="0" w:color="auto"/>
-        </w:rPr>
-        <w:br/>
-        <w:t>Yes, there is an UPDATE form for M:M relationship Rental Order Items &amp; Gear Items</w:t>
-      </w:r>
-      <w:r>
-        <w:rPr>
-          <w:rFonts w:eastAsia="Times New Roman"/>
-          <w:bdr w:val="none" w:sz="0" w:space="0" w:color="auto"/>
-        </w:rPr>
-        <w:br/>
-        <w:t>Do you have any other suggestions for the team to help with their HTML UI? For example, using AS aliases to</w:t>
-      </w:r>
-      <w:r>
-        <w:rPr>
-          <w:rFonts w:eastAsia="Times New Roman"/>
-          <w:bdr w:val="none" w:sz="0" w:space="0" w:color="auto"/>
-        </w:rPr>
-        <w:br/>
-        <w:t xml:space="preserve">replace obscure column names such as </w:t>
-      </w:r>
-      <w:proofErr w:type="spellStart"/>
-      <w:r>
-        <w:rPr>
-          <w:rFonts w:eastAsia="Times New Roman"/>
-          <w:bdr w:val="none" w:sz="0" w:space="0" w:color="auto"/>
-        </w:rPr>
-        <w:t>fname</w:t>
-      </w:r>
-      <w:proofErr w:type="spellEnd"/>
-      <w:r>
-        <w:rPr>
-          <w:rFonts w:eastAsia="Times New Roman"/>
-          <w:bdr w:val="none" w:sz="0" w:space="0" w:color="auto"/>
-        </w:rPr>
-        <w:t xml:space="preserve"> with First Name.</w:t>
-      </w:r>
-      <w:r>
-        <w:rPr>
-          <w:rFonts w:eastAsia="Times New Roman"/>
-          <w:bdr w:val="none" w:sz="0" w:space="0" w:color="auto"/>
-        </w:rPr>
-        <w:br/>
-        <w:t>I think that having to click 'Back to Index' is a bit unintuitive and having just the page selector at the top on any</w:t>
-      </w:r>
-      <w:r>
-        <w:rPr>
-          <w:rFonts w:eastAsia="Times New Roman"/>
-          <w:bdr w:val="none" w:sz="0" w:space="0" w:color="auto"/>
-        </w:rPr>
-        <w:br/>
-        <w:t>page will make the user experience much cleaner</w:t>
-      </w:r>
-    </w:p>
-    <w:p>
-      <w:pPr>
-        <w:pBdr>
-          <w:top w:val="none" w:sz="0" w:space="0" w:color="auto"/>
-          <w:left w:val="none" w:sz="0" w:space="0" w:color="auto"/>
-          <w:bottom w:val="none" w:sz="0" w:space="0" w:color="auto"/>
-          <w:right w:val="none" w:sz="0" w:space="0" w:color="auto"/>
-          <w:between w:val="none" w:sz="0" w:space="0" w:color="auto"/>
-          <w:bar w:val="none" w:sz="0" w:color="auto"/>
-        </w:pBdr>
-        <w:rPr>
-          <w:rFonts w:eastAsia="Times New Roman"/>
-          <w:bdr w:val="none" w:sz="0" w:space="0" w:color="auto"/>
-        </w:rPr>
-      </w:pPr>
-    </w:p>
-    <w:p>
-      <w:pPr>
-        <w:pBdr>
-          <w:top w:val="none" w:sz="0" w:space="0" w:color="auto"/>
-          <w:left w:val="none" w:sz="0" w:space="0" w:color="auto"/>
-          <w:bottom w:val="none" w:sz="0" w:space="0" w:color="auto"/>
-          <w:right w:val="none" w:sz="0" w:space="0" w:color="auto"/>
-          <w:between w:val="none" w:sz="0" w:space="0" w:color="auto"/>
-          <w:bar w:val="none" w:sz="0" w:color="auto"/>
-        </w:pBdr>
-        <w:rPr>
-          <w:rFonts w:eastAsia="Times New Roman"/>
-          <w:bdr w:val="none" w:sz="0" w:space="0" w:color="auto"/>
-        </w:rPr>
-      </w:pPr>
-    </w:p>
-    <w:p>
-      <w:pPr>
-        <w:pBdr>
-          <w:top w:val="none" w:sz="0" w:space="0" w:color="auto"/>
-          <w:left w:val="none" w:sz="0" w:space="0" w:color="auto"/>
-          <w:bottom w:val="none" w:sz="0" w:space="0" w:color="auto"/>
-          <w:right w:val="none" w:sz="0" w:space="0" w:color="auto"/>
-          <w:between w:val="none" w:sz="0" w:space="0" w:color="auto"/>
-          <w:bar w:val="none" w:sz="0" w:color="auto"/>
-        </w:pBdr>
-        <w:rPr>
-          <w:rFonts w:eastAsia="Times New Roman"/>
-          <w:bdr w:val="none" w:sz="0" w:space="0" w:color="auto"/>
-        </w:rPr>
-      </w:pPr>
-      <w:r>
-        <w:rPr>
-          <w:rFonts w:eastAsia="Times New Roman"/>
-          <w:bdr w:val="none" w:sz="0" w:space="0" w:color="auto"/>
-        </w:rPr>
-        <w:t>Nicole Rem Pingul</w:t>
-      </w:r>
-      <w:r>
-        <w:rPr>
-          <w:rFonts w:eastAsia="Times New Roman"/>
-          <w:bdr w:val="none" w:sz="0" w:space="0" w:color="auto"/>
-        </w:rPr>
-        <w:br/>
-        <w:t>Hi Group 80,</w:t>
-      </w:r>
-      <w:r>
-        <w:rPr>
-          <w:rFonts w:eastAsia="Times New Roman"/>
-          <w:bdr w:val="none" w:sz="0" w:space="0" w:color="auto"/>
-        </w:rPr>
-        <w:br/>
-        <w:t xml:space="preserve">The UI utilizes a SELECT for every table in the schema since each page has a table showing </w:t>
-      </w:r>
-      <w:r>
-        <w:rPr>
-          <w:rFonts w:eastAsia="Times New Roman"/>
-          <w:bdr w:val="none" w:sz="0" w:space="0" w:color="auto"/>
-        </w:rPr>
-        <w:lastRenderedPageBreak/>
-        <w:t>sample</w:t>
-      </w:r>
-      <w:r>
-        <w:rPr>
-          <w:rFonts w:eastAsia="Times New Roman"/>
-          <w:bdr w:val="none" w:sz="0" w:space="0" w:color="auto"/>
-        </w:rPr>
-        <w:br/>
-        <w:t>data</w:t>
-      </w:r>
-      <w:r>
-        <w:rPr>
-          <w:rFonts w:eastAsia="Times New Roman"/>
-          <w:bdr w:val="none" w:sz="0" w:space="0" w:color="auto"/>
-        </w:rPr>
-        <w:br/>
-        <w:t>The UI implements an INSERT form for Customers, Employees, Gear Items, Rental Orders, Service</w:t>
-      </w:r>
-      <w:r>
-        <w:rPr>
-          <w:rFonts w:eastAsia="Times New Roman"/>
-          <w:bdr w:val="none" w:sz="0" w:space="0" w:color="auto"/>
-        </w:rPr>
-        <w:br/>
-        <w:t>Tickets, and Service Ticket Items</w:t>
-      </w:r>
-      <w:r>
-        <w:rPr>
-          <w:rFonts w:eastAsia="Times New Roman"/>
-          <w:bdr w:val="none" w:sz="0" w:space="0" w:color="auto"/>
-        </w:rPr>
-        <w:br/>
-        <w:t>The UI has DELETE form for every entity and for M:M relationship between Rental Order Items</w:t>
-      </w:r>
-      <w:r>
-        <w:rPr>
-          <w:rFonts w:eastAsia="Times New Roman"/>
-          <w:bdr w:val="none" w:sz="0" w:space="0" w:color="auto"/>
-        </w:rPr>
-        <w:br/>
-        <w:t>and Gear Items.</w:t>
-      </w:r>
-      <w:r>
-        <w:rPr>
-          <w:rFonts w:eastAsia="Times New Roman"/>
-          <w:bdr w:val="none" w:sz="0" w:space="0" w:color="auto"/>
-        </w:rPr>
-        <w:br/>
-        <w:t>There is an UPDATE form for each entity and for M:M relationship between Rental Order Items</w:t>
-      </w:r>
-      <w:r>
-        <w:rPr>
-          <w:rFonts w:eastAsia="Times New Roman"/>
-          <w:bdr w:val="none" w:sz="0" w:space="0" w:color="auto"/>
-        </w:rPr>
-        <w:br/>
-        <w:t>and Gear Items.</w:t>
-      </w:r>
-      <w:r>
-        <w:rPr>
-          <w:rFonts w:eastAsia="Times New Roman"/>
-          <w:bdr w:val="none" w:sz="0" w:space="0" w:color="auto"/>
-        </w:rPr>
-        <w:br/>
-        <w:t xml:space="preserve">I </w:t>
-      </w:r>
-      <w:proofErr w:type="spellStart"/>
-      <w:r>
-        <w:rPr>
-          <w:rFonts w:eastAsia="Times New Roman"/>
-          <w:bdr w:val="none" w:sz="0" w:space="0" w:color="auto"/>
-        </w:rPr>
-        <w:t>thikn</w:t>
-      </w:r>
-      <w:proofErr w:type="spellEnd"/>
-      <w:r>
-        <w:rPr>
-          <w:rFonts w:eastAsia="Times New Roman"/>
-          <w:bdr w:val="none" w:sz="0" w:space="0" w:color="auto"/>
-        </w:rPr>
-        <w:t xml:space="preserve"> it would be nice to incorporate a navigation bar at the top of each page or on the side to</w:t>
-      </w:r>
-      <w:r>
-        <w:rPr>
-          <w:rFonts w:eastAsia="Times New Roman"/>
-          <w:bdr w:val="none" w:sz="0" w:space="0" w:color="auto"/>
-        </w:rPr>
-        <w:br/>
-        <w:t>easily navigate between pages without going back to the home page every time a user would like to</w:t>
-      </w:r>
-      <w:r>
-        <w:rPr>
-          <w:rFonts w:eastAsia="Times New Roman"/>
-          <w:bdr w:val="none" w:sz="0" w:space="0" w:color="auto"/>
-        </w:rPr>
-        <w:br/>
-        <w:t xml:space="preserve">view another page. I also noticed that you guys were missing </w:t>
-      </w:r>
-      <w:proofErr w:type="gramStart"/>
-      <w:r>
-        <w:rPr>
-          <w:rFonts w:eastAsia="Times New Roman"/>
-          <w:bdr w:val="none" w:sz="0" w:space="0" w:color="auto"/>
-        </w:rPr>
-        <w:t>a</w:t>
-      </w:r>
-      <w:proofErr w:type="gramEnd"/>
-      <w:r>
-        <w:rPr>
-          <w:rFonts w:eastAsia="Times New Roman"/>
-          <w:bdr w:val="none" w:sz="0" w:space="0" w:color="auto"/>
-        </w:rPr>
-        <w:t xml:space="preserve"> ERD in your PDF.</w:t>
-      </w:r>
-      <w:r>
-        <w:rPr>
-          <w:rFonts w:eastAsia="Times New Roman"/>
-          <w:bdr w:val="none" w:sz="0" w:space="0" w:color="auto"/>
-        </w:rPr>
-        <w:br/>
-        <w:t>Also, I would suggest using a JOIN for Rental Orders to incorporate customer's names and</w:t>
-      </w:r>
-      <w:r>
-        <w:rPr>
-          <w:rFonts w:eastAsia="Times New Roman"/>
-          <w:bdr w:val="none" w:sz="0" w:space="0" w:color="auto"/>
-        </w:rPr>
-        <w:br/>
-        <w:t>employee names for the tables. It would be easier to understand the data provided that way. You can</w:t>
-      </w:r>
-      <w:r>
-        <w:rPr>
-          <w:rFonts w:eastAsia="Times New Roman"/>
-          <w:bdr w:val="none" w:sz="0" w:space="0" w:color="auto"/>
-        </w:rPr>
-        <w:br/>
-        <w:t>also apply it the Service Ticket Items and Rental Order Items with the gear items as well.</w:t>
-      </w:r>
-      <w:r>
-        <w:rPr>
-          <w:rFonts w:eastAsia="Times New Roman"/>
-          <w:bdr w:val="none" w:sz="0" w:space="0" w:color="auto"/>
-        </w:rPr>
-        <w:br/>
-        <w:t>Great job with your guys' website so far!</w:t>
-      </w:r>
-      <w:r>
-        <w:rPr>
-          <w:rFonts w:eastAsia="Times New Roman"/>
-          <w:bdr w:val="none" w:sz="0" w:space="0" w:color="auto"/>
-        </w:rPr>
-        <w:br/>
-        <w:t>Good luck with the rest of your project</w:t>
-      </w:r>
-    </w:p>
-    <w:p>
-      <w:pPr>
-        <w:pStyle w:val="Body"/>
+        <w:t xml:space="preserve"> Final</w:t>
+      </w:r>
+    </w:p>
+    <w:p>
+      <w:pPr>
+        <w:pStyle w:val="Body"/>
+        <w:rPr>
+          <w:sz w:val="30"/>
+          <w:szCs w:val="30"/>
+        </w:rPr>
+      </w:pPr>
+      <w:r>
         <w:rPr>
           <w:b/>
           <w:bCs/>
           <w:sz w:val="30"/>
           <w:szCs w:val="30"/>
         </w:rPr>
-      </w:pPr>
+        <w:tab/>
+      </w:r>
+      <w:r>
+        <w:rPr>
+          <w:sz w:val="24"/>
+          <w:szCs w:val="24"/>
+        </w:rPr>
+        <w:t>i) Grader</w:t>
+      </w:r>
+      <w:r>
+        <w:rPr>
+          <w:sz w:val="24"/>
+          <w:szCs w:val="24"/>
+        </w:rPr>
+        <w:t xml:space="preserve"> feedback received: Step 3 PDF submission was missing the ERD. </w:t>
+      </w:r>
     </w:p>
     <w:p>
       <w:pPr>
@@ -1005,7 +218,88 @@
           <w:sz w:val="30"/>
           <w:szCs w:val="30"/>
         </w:rPr>
-        <w:t>c) Fixes Based on Feedback from Step 3</w:t>
+        <w:t>c) Changes Based on Feedback from Step 3 Final</w:t>
+      </w:r>
+    </w:p>
+    <w:p>
+      <w:pPr>
+        <w:pStyle w:val="Body"/>
+        <w:rPr>
+          <w:sz w:val="24"/>
+          <w:szCs w:val="24"/>
+        </w:rPr>
+      </w:pPr>
+      <w:r>
+        <w:rPr>
+          <w:b/>
+          <w:bCs/>
+          <w:sz w:val="30"/>
+          <w:szCs w:val="30"/>
+        </w:rPr>
+        <w:tab/>
+      </w:r>
+      <w:r>
+        <w:rPr>
+          <w:sz w:val="24"/>
+          <w:szCs w:val="24"/>
+        </w:rPr>
+        <w:t>i)</w:t>
+      </w:r>
+      <w:r>
+        <w:rPr>
+          <w:sz w:val="24"/>
+          <w:szCs w:val="24"/>
+        </w:rPr>
+        <w:t xml:space="preserve"> Added ERD to the PDF.</w:t>
+      </w:r>
+    </w:p>
+    <w:p>
+      <w:pPr>
+        <w:pStyle w:val="Body"/>
+        <w:rPr>
+          <w:b/>
+          <w:bCs/>
+          <w:sz w:val="30"/>
+          <w:szCs w:val="30"/>
+        </w:rPr>
+      </w:pPr>
+    </w:p>
+    <w:p>
+      <w:pPr>
+        <w:pStyle w:val="Body"/>
+        <w:rPr>
+          <w:b/>
+          <w:bCs/>
+          <w:sz w:val="30"/>
+          <w:szCs w:val="30"/>
+        </w:rPr>
+      </w:pPr>
+      <w:r>
+        <w:rPr>
+          <w:b/>
+          <w:bCs/>
+          <w:sz w:val="30"/>
+          <w:szCs w:val="30"/>
+        </w:rPr>
+        <w:t>d</w:t>
+      </w:r>
+      <w:r>
+        <w:rPr>
+          <w:b/>
+          <w:bCs/>
+          <w:sz w:val="30"/>
+          <w:szCs w:val="30"/>
+        </w:rPr>
+        <w:t>) Fixes Based on Feedback from Step 3</w:t>
+      </w:r>
+      <w:r>
+        <w:rPr>
+          <w:b/>
+          <w:bCs/>
+          <w:sz w:val="30"/>
+          <w:szCs w:val="30"/>
+        </w:rPr>
+        <w:t xml:space="preserve"> Draft</w:t>
       </w:r>
     </w:p>
     <w:p>
@@ -1075,7 +369,43 @@
           <w:sz w:val="30"/>
           <w:szCs w:val="30"/>
         </w:rPr>
-        <w:t>d) Design Changes</w:t>
+        <w:t>e</w:t>
+      </w:r>
+      <w:r>
+        <w:rPr>
+          <w:b/>
+          <w:bCs/>
+          <w:sz w:val="30"/>
+          <w:szCs w:val="30"/>
+        </w:rPr>
+        <w:t>) Design Changes</w:t>
+      </w:r>
+      <w:r>
+        <w:rPr>
+          <w:b/>
+          <w:bCs/>
+          <w:sz w:val="30"/>
+          <w:szCs w:val="30"/>
+        </w:rPr>
+        <w:t xml:space="preserve"> </w:t>
+      </w:r>
+      <w:r>
+        <w:rPr>
+          <w:b/>
+          <w:bCs/>
+          <w:sz w:val="30"/>
+          <w:szCs w:val="30"/>
+        </w:rPr>
+        <w:t>f</w:t>
+      </w:r>
+      <w:r>
+        <w:rPr>
+          <w:b/>
+          <w:bCs/>
+          <w:sz w:val="30"/>
+          <w:szCs w:val="30"/>
+        </w:rPr>
+        <w:t>rom Step 3</w:t>
       </w:r>
     </w:p>
     <w:p>
@@ -1156,23 +486,7 @@
           <w:sz w:val="24"/>
           <w:szCs w:val="24"/>
         </w:rPr>
-        <w:t xml:space="preserve">Fixed </w:t>
-      </w:r>
-      <w:proofErr w:type="spellStart"/>
-      <w:r>
-        <w:rPr>
-          <w:sz w:val="24"/>
-          <w:szCs w:val="24"/>
-        </w:rPr>
-        <w:t>run_action</w:t>
-      </w:r>
-      <w:proofErr w:type="spellEnd"/>
-      <w:r>
-        <w:rPr>
-          <w:sz w:val="24"/>
-          <w:szCs w:val="24"/>
-        </w:rPr>
-        <w:t xml:space="preserve"> function to safely handle stored procedure calls by draining results set to avoid errors.</w:t>
+        <w:t>Fixed run_action function to safely handle stored procedure calls by draining results set to avoid errors.</w:t>
       </w:r>
     </w:p>
     <w:p>
@@ -1192,23 +506,7 @@
           <w:sz w:val="24"/>
           <w:szCs w:val="24"/>
         </w:rPr>
-        <w:t xml:space="preserve">Fixed UI schema </w:t>
-      </w:r>
-      <w:proofErr w:type="spellStart"/>
-      <w:r>
-        <w:rPr>
-          <w:sz w:val="24"/>
-          <w:szCs w:val="24"/>
-        </w:rPr>
-        <w:t>enum</w:t>
-      </w:r>
-      <w:proofErr w:type="spellEnd"/>
-      <w:r>
-        <w:rPr>
-          <w:sz w:val="24"/>
-          <w:szCs w:val="24"/>
-        </w:rPr>
-        <w:t xml:space="preserve"> mismatches.</w:t>
+        <w:t>Fixed UI schema enum mismatches.</w:t>
       </w:r>
     </w:p>
     <w:p>
@@ -1240,7 +538,7 @@
           <w:sz w:val="30"/>
           <w:szCs w:val="30"/>
         </w:rPr>
-        <w:t>e</w:t>
+        <w:t>f</w:t>
       </w:r>
       <w:r>
         <w:rPr>
@@ -1299,8 +597,7 @@
           <w:sz w:val="30"/>
           <w:szCs w:val="30"/>
         </w:rPr>
-        <w:lastRenderedPageBreak/>
-        <w:t>f</w:t>
+        <w:t>g</w:t>
       </w:r>
       <w:r>
         <w:rPr>
@@ -1320,6 +617,7 @@
         <w:pStyle w:val="Body"/>
       </w:pPr>
       <w:r>
+        <w:lastRenderedPageBreak/>
         <w:t>Feedback on the Step 1 submission was mainly positive, with reviewers agreeing that the system design, entities, relationships, and ERD were clear and aligned with requirements. Only minor issues were identified and addressed.</w:t>
       </w:r>
     </w:p>
@@ -1348,7 +646,6 @@
       <w:r>
         <w:t xml:space="preserve">An error was identified in the database outline where </w:t>
       </w:r>
-      <w:proofErr w:type="spellStart"/>
       <w:r>
         <w:rPr>
           <w:rFonts w:ascii="Courier New" w:hAnsi="Courier New"/>
@@ -1357,11 +654,9 @@
         </w:rPr>
         <w:t>customer_id</w:t>
       </w:r>
-      <w:proofErr w:type="spellEnd"/>
       <w:r>
         <w:t xml:space="preserve"> in the </w:t>
       </w:r>
-      <w:proofErr w:type="spellStart"/>
       <w:r>
         <w:rPr>
           <w:rFonts w:ascii="Courier New" w:hAnsi="Courier New"/>
@@ -1370,43 +665,16 @@
         </w:rPr>
         <w:t>rental_orders</w:t>
       </w:r>
-      <w:proofErr w:type="spellEnd"/>
-      <w:r>
-        <w:t xml:space="preserve"> table incorrectly referenced the </w:t>
-      </w:r>
-      <w:proofErr w:type="gramStart"/>
-      <w:r>
-        <w:t>employees</w:t>
-      </w:r>
-      <w:proofErr w:type="gramEnd"/>
-      <w:r>
-        <w:t xml:space="preserve"> table. This was corrected to reference </w:t>
-      </w:r>
-      <w:r>
-        <w:rPr>
-          <w:rFonts w:ascii="Courier New" w:hAnsi="Courier New"/>
-          <w:sz w:val="20"/>
-          <w:szCs w:val="20"/>
-        </w:rPr>
-        <w:t>customers(</w:t>
-      </w:r>
-      <w:proofErr w:type="spellStart"/>
-      <w:r>
-        <w:rPr>
-          <w:rFonts w:ascii="Courier New" w:hAnsi="Courier New"/>
-          <w:sz w:val="20"/>
-          <w:szCs w:val="20"/>
-        </w:rPr>
-        <w:t>customer_id</w:t>
-      </w:r>
-      <w:proofErr w:type="spellEnd"/>
-      <w:r>
-        <w:rPr>
-          <w:rFonts w:ascii="Courier New" w:hAnsi="Courier New"/>
-          <w:sz w:val="20"/>
-          <w:szCs w:val="20"/>
-        </w:rPr>
-        <w:t>)</w:t>
+      <w:r>
+        <w:t xml:space="preserve"> table incorrectly referenced the employees table. This was corrected to reference </w:t>
+      </w:r>
+      <w:r>
+        <w:rPr>
+          <w:rFonts w:ascii="Courier New" w:hAnsi="Courier New"/>
+          <w:sz w:val="20"/>
+          <w:szCs w:val="20"/>
+        </w:rPr>
+        <w:t>customers(customer_id)</w:t>
       </w:r>
       <w:r>
         <w:t>, aligning the outline with the ERD and business logic.</w:t>
@@ -1422,44 +690,16 @@
         <w:pStyle w:val="Body"/>
       </w:pPr>
       <w:r>
-        <w:t xml:space="preserve">A minor naming inconsistency was identified in the </w:t>
-      </w:r>
-      <w:proofErr w:type="spellStart"/>
-      <w:r>
-        <w:t>rental_order_items</w:t>
-      </w:r>
-      <w:proofErr w:type="spellEnd"/>
-      <w:r>
-        <w:t xml:space="preserve"> table, where the foreign key name did not match the rental order primary key naming convention. Fixed foreign key reference so </w:t>
-      </w:r>
-      <w:proofErr w:type="spellStart"/>
-      <w:r>
-        <w:rPr>
-          <w:rFonts w:ascii="Courier New" w:hAnsi="Courier New"/>
-          <w:sz w:val="20"/>
-          <w:szCs w:val="20"/>
-        </w:rPr>
-        <w:t>rental_</w:t>
-      </w:r>
-      <w:proofErr w:type="gramStart"/>
-      <w:r>
-        <w:rPr>
-          <w:rFonts w:ascii="Courier New" w:hAnsi="Courier New"/>
-          <w:sz w:val="20"/>
-          <w:szCs w:val="20"/>
-        </w:rPr>
-        <w:t>orders.customer</w:t>
-      </w:r>
-      <w:proofErr w:type="gramEnd"/>
-      <w:r>
-        <w:rPr>
-          <w:rFonts w:ascii="Courier New" w:hAnsi="Courier New"/>
-          <w:sz w:val="20"/>
-          <w:szCs w:val="20"/>
-        </w:rPr>
-        <w:t>_id</w:t>
-      </w:r>
-      <w:proofErr w:type="spellEnd"/>
+        <w:t xml:space="preserve">A minor naming inconsistency was identified in the rental_order_items table, where the foreign key name did not match the rental order primary key naming convention. Fixed foreign key reference so </w:t>
+      </w:r>
+      <w:r>
+        <w:rPr>
+          <w:rFonts w:ascii="Courier New" w:hAnsi="Courier New"/>
+          <w:sz w:val="20"/>
+          <w:szCs w:val="20"/>
+        </w:rPr>
+        <w:t>rental_orders.customer_id</w:t>
+      </w:r>
       <w:r>
         <w:t xml:space="preserve"> correctly references</w:t>
       </w:r>
@@ -1469,25 +709,7 @@
           <w:sz w:val="20"/>
           <w:szCs w:val="20"/>
         </w:rPr>
-        <w:t xml:space="preserve"> customers(</w:t>
-      </w:r>
-      <w:proofErr w:type="spellStart"/>
-      <w:r>
-        <w:rPr>
-          <w:rFonts w:ascii="Courier New" w:hAnsi="Courier New"/>
-          <w:sz w:val="20"/>
-          <w:szCs w:val="20"/>
-        </w:rPr>
-        <w:t>customer_id</w:t>
-      </w:r>
-      <w:proofErr w:type="spellEnd"/>
-      <w:r>
-        <w:rPr>
-          <w:rFonts w:ascii="Courier New" w:hAnsi="Courier New"/>
-          <w:sz w:val="20"/>
-          <w:szCs w:val="20"/>
-        </w:rPr>
-        <w:t>)</w:t>
+        <w:t xml:space="preserve"> customers(customer_id)</w:t>
       </w:r>
       <w:r>
         <w:t xml:space="preserve">.  </w:t>
@@ -1505,7 +727,6 @@
       <w:r>
         <w:t xml:space="preserve">Clarified meaning of </w:t>
       </w:r>
-      <w:proofErr w:type="spellStart"/>
       <w:r>
         <w:rPr>
           <w:rFonts w:ascii="Courier New" w:hAnsi="Courier New"/>
@@ -1514,7 +735,6 @@
         </w:rPr>
         <w:t>employees.is_active</w:t>
       </w:r>
-      <w:proofErr w:type="spellEnd"/>
       <w:r>
         <w:t xml:space="preserve"> (employee is currently employed/authorized to create orders and service tickets).</w:t>
       </w:r>
@@ -1550,7 +770,7 @@
           <w:sz w:val="30"/>
           <w:szCs w:val="30"/>
         </w:rPr>
-        <w:t>g</w:t>
+        <w:t>h</w:t>
       </w:r>
       <w:r>
         <w:rPr>
@@ -1673,23 +893,13 @@
           <w:szCs w:val="20"/>
         </w:rPr>
       </w:pPr>
-      <w:proofErr w:type="spellStart"/>
-      <w:r>
-        <w:rPr>
-          <w:rFonts w:ascii="Courier New" w:hAnsi="Courier New"/>
-          <w:sz w:val="20"/>
-          <w:szCs w:val="20"/>
-        </w:rPr>
-        <w:t>customer_id</w:t>
-      </w:r>
-      <w:proofErr w:type="spellEnd"/>
-      <w:r>
-        <w:rPr>
-          <w:rFonts w:ascii="Courier New" w:hAnsi="Courier New"/>
-          <w:sz w:val="20"/>
-          <w:szCs w:val="20"/>
-        </w:rPr>
-        <w:t>: INT, AUTO_INCREMENT, PRIMARY KEY, NOT NULL</w:t>
+      <w:r>
+        <w:rPr>
+          <w:rFonts w:ascii="Courier New" w:hAnsi="Courier New"/>
+          <w:sz w:val="20"/>
+          <w:szCs w:val="20"/>
+        </w:rPr>
+        <w:t>customer_id: INT, AUTO_INCREMENT, PRIMARY KEY, NOT NULL</w:t>
       </w:r>
     </w:p>
     <w:p>
@@ -1705,42 +915,13 @@
           <w:szCs w:val="20"/>
         </w:rPr>
       </w:pPr>
-      <w:proofErr w:type="spellStart"/>
-      <w:r>
-        <w:rPr>
-          <w:rFonts w:ascii="Courier New" w:hAnsi="Courier New"/>
-          <w:sz w:val="20"/>
-          <w:szCs w:val="20"/>
-        </w:rPr>
-        <w:lastRenderedPageBreak/>
-        <w:t>first_name</w:t>
-      </w:r>
-      <w:proofErr w:type="spellEnd"/>
-      <w:r>
-        <w:rPr>
-          <w:rFonts w:ascii="Courier New" w:hAnsi="Courier New"/>
-          <w:sz w:val="20"/>
-          <w:szCs w:val="20"/>
-        </w:rPr>
-        <w:t xml:space="preserve">: </w:t>
-      </w:r>
-      <w:proofErr w:type="gramStart"/>
-      <w:r>
-        <w:rPr>
-          <w:rFonts w:ascii="Courier New" w:hAnsi="Courier New"/>
-          <w:sz w:val="20"/>
-          <w:szCs w:val="20"/>
-        </w:rPr>
-        <w:t>VARCHAR(</w:t>
-      </w:r>
-      <w:proofErr w:type="gramEnd"/>
-      <w:r>
-        <w:rPr>
-          <w:rFonts w:ascii="Courier New" w:hAnsi="Courier New"/>
-          <w:sz w:val="20"/>
-          <w:szCs w:val="20"/>
-        </w:rPr>
-        <w:t>100), NOT NULL</w:t>
+      <w:r>
+        <w:rPr>
+          <w:rFonts w:ascii="Courier New" w:hAnsi="Courier New"/>
+          <w:sz w:val="20"/>
+          <w:szCs w:val="20"/>
+        </w:rPr>
+        <w:t>first_name: VARCHAR(100), NOT NULL</w:t>
       </w:r>
     </w:p>
     <w:p>
@@ -1756,41 +937,13 @@
           <w:szCs w:val="20"/>
         </w:rPr>
       </w:pPr>
-      <w:proofErr w:type="spellStart"/>
-      <w:r>
-        <w:rPr>
-          <w:rFonts w:ascii="Courier New" w:hAnsi="Courier New"/>
-          <w:sz w:val="20"/>
-          <w:szCs w:val="20"/>
-        </w:rPr>
-        <w:t>last_name</w:t>
-      </w:r>
-      <w:proofErr w:type="spellEnd"/>
-      <w:r>
-        <w:rPr>
-          <w:rFonts w:ascii="Courier New" w:hAnsi="Courier New"/>
-          <w:sz w:val="20"/>
-          <w:szCs w:val="20"/>
-        </w:rPr>
-        <w:t xml:space="preserve">: </w:t>
-      </w:r>
-      <w:proofErr w:type="gramStart"/>
-      <w:r>
-        <w:rPr>
-          <w:rFonts w:ascii="Courier New" w:hAnsi="Courier New"/>
-          <w:sz w:val="20"/>
-          <w:szCs w:val="20"/>
-        </w:rPr>
-        <w:t>VARCHAR(</w:t>
-      </w:r>
-      <w:proofErr w:type="gramEnd"/>
-      <w:r>
-        <w:rPr>
-          <w:rFonts w:ascii="Courier New" w:hAnsi="Courier New"/>
-          <w:sz w:val="20"/>
-          <w:szCs w:val="20"/>
-        </w:rPr>
-        <w:t>100), NOT NULL</w:t>
+      <w:r>
+        <w:rPr>
+          <w:rFonts w:ascii="Courier New" w:hAnsi="Courier New"/>
+          <w:sz w:val="20"/>
+          <w:szCs w:val="20"/>
+        </w:rPr>
+        <w:t>last_name: VARCHAR(100), NOT NULL</w:t>
       </w:r>
     </w:p>
     <w:p>
@@ -1814,6 +967,7 @@
           <w:szCs w:val="20"/>
           <w:lang w:val="it-IT"/>
         </w:rPr>
+        <w:lastRenderedPageBreak/>
         <w:t>phone: VARCHAR(20), NULL</w:t>
       </w:r>
     </w:p>
@@ -1836,25 +990,7 @@
           <w:sz w:val="20"/>
           <w:szCs w:val="20"/>
         </w:rPr>
-        <w:t xml:space="preserve">email: </w:t>
-      </w:r>
-      <w:proofErr w:type="gramStart"/>
-      <w:r>
-        <w:rPr>
-          <w:rFonts w:ascii="Courier New" w:hAnsi="Courier New"/>
-          <w:sz w:val="20"/>
-          <w:szCs w:val="20"/>
-        </w:rPr>
-        <w:t>VARCHAR(</w:t>
-      </w:r>
-      <w:proofErr w:type="gramEnd"/>
-      <w:r>
-        <w:rPr>
-          <w:rFonts w:ascii="Courier New" w:hAnsi="Courier New"/>
-          <w:sz w:val="20"/>
-          <w:szCs w:val="20"/>
-        </w:rPr>
-        <w:t>255), NULL</w:t>
+        <w:t>email: VARCHAR(255), NULL</w:t>
       </w:r>
     </w:p>
     <w:p>
@@ -1881,13 +1017,8 @@
         </w:numPr>
       </w:pPr>
       <w:r>
-        <w:t xml:space="preserve">One-to-many (1:M) relationship with </w:t>
-      </w:r>
-      <w:proofErr w:type="spellStart"/>
-      <w:r>
-        <w:t>rental_orders</w:t>
-      </w:r>
-      <w:proofErr w:type="spellEnd"/>
+        <w:t>One-to-many (1:M) relationship with rental_orders</w:t>
+      </w:r>
     </w:p>
     <w:p>
       <w:pPr>
@@ -1941,23 +1072,13 @@
           <w:szCs w:val="20"/>
         </w:rPr>
       </w:pPr>
-      <w:proofErr w:type="spellStart"/>
-      <w:r>
-        <w:rPr>
-          <w:rFonts w:ascii="Courier New" w:hAnsi="Courier New"/>
-          <w:sz w:val="20"/>
-          <w:szCs w:val="20"/>
-        </w:rPr>
-        <w:t>employee_id</w:t>
-      </w:r>
-      <w:proofErr w:type="spellEnd"/>
-      <w:r>
-        <w:rPr>
-          <w:rFonts w:ascii="Courier New" w:hAnsi="Courier New"/>
-          <w:sz w:val="20"/>
-          <w:szCs w:val="20"/>
-        </w:rPr>
-        <w:t>: INT, AUTO_INCREMENT, PRIMARY KEY, NOT NULL</w:t>
+      <w:r>
+        <w:rPr>
+          <w:rFonts w:ascii="Courier New" w:hAnsi="Courier New"/>
+          <w:sz w:val="20"/>
+          <w:szCs w:val="20"/>
+        </w:rPr>
+        <w:t>employee_id: INT, AUTO_INCREMENT, PRIMARY KEY, NOT NULL</w:t>
       </w:r>
     </w:p>
     <w:p>
@@ -1973,41 +1094,13 @@
           <w:szCs w:val="20"/>
         </w:rPr>
       </w:pPr>
-      <w:proofErr w:type="spellStart"/>
-      <w:r>
-        <w:rPr>
-          <w:rFonts w:ascii="Courier New" w:hAnsi="Courier New"/>
-          <w:sz w:val="20"/>
-          <w:szCs w:val="20"/>
-        </w:rPr>
-        <w:t>first_name</w:t>
-      </w:r>
-      <w:proofErr w:type="spellEnd"/>
-      <w:r>
-        <w:rPr>
-          <w:rFonts w:ascii="Courier New" w:hAnsi="Courier New"/>
-          <w:sz w:val="20"/>
-          <w:szCs w:val="20"/>
-        </w:rPr>
-        <w:t xml:space="preserve">: </w:t>
-      </w:r>
-      <w:proofErr w:type="gramStart"/>
-      <w:r>
-        <w:rPr>
-          <w:rFonts w:ascii="Courier New" w:hAnsi="Courier New"/>
-          <w:sz w:val="20"/>
-          <w:szCs w:val="20"/>
-        </w:rPr>
-        <w:t>VARCHAR(</w:t>
-      </w:r>
-      <w:proofErr w:type="gramEnd"/>
-      <w:r>
-        <w:rPr>
-          <w:rFonts w:ascii="Courier New" w:hAnsi="Courier New"/>
-          <w:sz w:val="20"/>
-          <w:szCs w:val="20"/>
-        </w:rPr>
-        <w:t>100), NOT NULL</w:t>
+      <w:r>
+        <w:rPr>
+          <w:rFonts w:ascii="Courier New" w:hAnsi="Courier New"/>
+          <w:sz w:val="20"/>
+          <w:szCs w:val="20"/>
+        </w:rPr>
+        <w:t>first_name: VARCHAR(100), NOT NULL</w:t>
       </w:r>
     </w:p>
     <w:p>
@@ -2023,41 +1116,13 @@
           <w:szCs w:val="20"/>
         </w:rPr>
       </w:pPr>
-      <w:proofErr w:type="spellStart"/>
-      <w:r>
-        <w:rPr>
-          <w:rFonts w:ascii="Courier New" w:hAnsi="Courier New"/>
-          <w:sz w:val="20"/>
-          <w:szCs w:val="20"/>
-        </w:rPr>
-        <w:t>last_name</w:t>
-      </w:r>
-      <w:proofErr w:type="spellEnd"/>
-      <w:r>
-        <w:rPr>
-          <w:rFonts w:ascii="Courier New" w:hAnsi="Courier New"/>
-          <w:sz w:val="20"/>
-          <w:szCs w:val="20"/>
-        </w:rPr>
-        <w:t xml:space="preserve">: </w:t>
-      </w:r>
-      <w:proofErr w:type="gramStart"/>
-      <w:r>
-        <w:rPr>
-          <w:rFonts w:ascii="Courier New" w:hAnsi="Courier New"/>
-          <w:sz w:val="20"/>
-          <w:szCs w:val="20"/>
-        </w:rPr>
-        <w:t>VARCHAR(</w:t>
-      </w:r>
-      <w:proofErr w:type="gramEnd"/>
-      <w:r>
-        <w:rPr>
-          <w:rFonts w:ascii="Courier New" w:hAnsi="Courier New"/>
-          <w:sz w:val="20"/>
-          <w:szCs w:val="20"/>
-        </w:rPr>
-        <w:t>100), NOT NULL</w:t>
+      <w:r>
+        <w:rPr>
+          <w:rFonts w:ascii="Courier New" w:hAnsi="Courier New"/>
+          <w:sz w:val="20"/>
+          <w:szCs w:val="20"/>
+        </w:rPr>
+        <w:t>last_name: VARCHAR(100), NOT NULL</w:t>
       </w:r>
     </w:p>
     <w:p>
@@ -2079,25 +1144,7 @@
           <w:sz w:val="20"/>
           <w:szCs w:val="20"/>
         </w:rPr>
-        <w:t xml:space="preserve">role: </w:t>
-      </w:r>
-      <w:proofErr w:type="gramStart"/>
-      <w:r>
-        <w:rPr>
-          <w:rFonts w:ascii="Courier New" w:hAnsi="Courier New"/>
-          <w:sz w:val="20"/>
-          <w:szCs w:val="20"/>
-        </w:rPr>
-        <w:t>VARCHAR(</w:t>
-      </w:r>
-      <w:proofErr w:type="gramEnd"/>
-      <w:r>
-        <w:rPr>
-          <w:rFonts w:ascii="Courier New" w:hAnsi="Courier New"/>
-          <w:sz w:val="20"/>
-          <w:szCs w:val="20"/>
-        </w:rPr>
-        <w:t>50), NOT NULL</w:t>
+        <w:t>role: VARCHAR(50), NOT NULL</w:t>
       </w:r>
     </w:p>
     <w:p>
@@ -2113,23 +1160,13 @@
           <w:szCs w:val="20"/>
         </w:rPr>
       </w:pPr>
-      <w:proofErr w:type="spellStart"/>
-      <w:r>
-        <w:rPr>
-          <w:rFonts w:ascii="Courier New" w:hAnsi="Courier New"/>
-          <w:sz w:val="20"/>
-          <w:szCs w:val="20"/>
-        </w:rPr>
-        <w:t>is_active</w:t>
-      </w:r>
-      <w:proofErr w:type="spellEnd"/>
-      <w:r>
-        <w:rPr>
-          <w:rFonts w:ascii="Courier New" w:hAnsi="Courier New"/>
-          <w:sz w:val="20"/>
-          <w:szCs w:val="20"/>
-        </w:rPr>
-        <w:t>: BOOLEAN, NOT NULL, DEFAULT TRUE</w:t>
+      <w:r>
+        <w:rPr>
+          <w:rFonts w:ascii="Courier New" w:hAnsi="Courier New"/>
+          <w:sz w:val="20"/>
+          <w:szCs w:val="20"/>
+        </w:rPr>
+        <w:t>is_active: BOOLEAN, NOT NULL, DEFAULT TRUE</w:t>
       </w:r>
     </w:p>
     <w:p>
@@ -2178,13 +1215,8 @@
         </w:numPr>
       </w:pPr>
       <w:r>
-        <w:t xml:space="preserve">One-to-many (1:M) relationship with </w:t>
-      </w:r>
-      <w:proofErr w:type="spellStart"/>
-      <w:r>
-        <w:t>rental_orders</w:t>
-      </w:r>
-      <w:proofErr w:type="spellEnd"/>
+        <w:t>One-to-many (1:M) relationship with rental_orders</w:t>
+      </w:r>
     </w:p>
     <w:p>
       <w:pPr>
@@ -2195,13 +1227,8 @@
         </w:numPr>
       </w:pPr>
       <w:r>
-        <w:t xml:space="preserve">One-to-many (1:M) relationship with </w:t>
-      </w:r>
-      <w:proofErr w:type="spellStart"/>
-      <w:r>
-        <w:t>service_tickets</w:t>
-      </w:r>
-      <w:proofErr w:type="spellEnd"/>
+        <w:t>One-to-many (1:M) relationship with service_tickets</w:t>
+      </w:r>
     </w:p>
     <w:p>
       <w:pPr>
@@ -2216,7 +1243,6 @@
           <w:numId w:val="8"/>
         </w:numPr>
       </w:pPr>
-      <w:proofErr w:type="spellStart"/>
       <w:r>
         <w:rPr>
           <w:rFonts w:ascii="Courier New" w:hAnsi="Courier New"/>
@@ -2225,7 +1251,6 @@
         </w:rPr>
         <w:t>gear_items</w:t>
       </w:r>
-      <w:proofErr w:type="spellEnd"/>
       <w:r>
         <w:t>: Records each physical piece of ski or snowboard-related equipment.</w:t>
       </w:r>
@@ -2257,23 +1282,13 @@
           <w:szCs w:val="20"/>
         </w:rPr>
       </w:pPr>
-      <w:proofErr w:type="spellStart"/>
-      <w:r>
-        <w:rPr>
-          <w:rFonts w:ascii="Courier New" w:hAnsi="Courier New"/>
-          <w:sz w:val="20"/>
-          <w:szCs w:val="20"/>
-        </w:rPr>
-        <w:t>gear_item_id</w:t>
-      </w:r>
-      <w:proofErr w:type="spellEnd"/>
-      <w:r>
-        <w:rPr>
-          <w:rFonts w:ascii="Courier New" w:hAnsi="Courier New"/>
-          <w:sz w:val="20"/>
-          <w:szCs w:val="20"/>
-        </w:rPr>
-        <w:t>: INT, AUTO_INCREMENT, PRIMARY KEY, NOT NULL</w:t>
+      <w:r>
+        <w:rPr>
+          <w:rFonts w:ascii="Courier New" w:hAnsi="Courier New"/>
+          <w:sz w:val="20"/>
+          <w:szCs w:val="20"/>
+        </w:rPr>
+        <w:t>gear_item_id: INT, AUTO_INCREMENT, PRIMARY KEY, NOT NULL</w:t>
       </w:r>
     </w:p>
     <w:p>
@@ -2295,18 +1310,8 @@
           <w:sz w:val="20"/>
           <w:szCs w:val="20"/>
         </w:rPr>
-        <w:t xml:space="preserve">category: </w:t>
-      </w:r>
-      <w:proofErr w:type="gramStart"/>
-      <w:r>
-        <w:rPr>
-          <w:rFonts w:ascii="Courier New" w:hAnsi="Courier New"/>
-          <w:sz w:val="20"/>
-          <w:szCs w:val="20"/>
-        </w:rPr>
-        <w:t>ENUM(</w:t>
-      </w:r>
-      <w:proofErr w:type="gramEnd"/>
+        <w:t>category: ENUM(</w:t>
+      </w:r>
       <w:r>
         <w:rPr>
           <w:rFonts w:ascii="Courier New" w:hAnsi="Courier New"/>
@@ -2324,7 +1329,6 @@
         </w:rPr>
         <w:t>snowboard</w:t>
       </w:r>
-      <w:proofErr w:type="gramStart"/>
       <w:r>
         <w:rPr>
           <w:rFonts w:ascii="Courier New" w:hAnsi="Courier New"/>
@@ -2351,7 +1355,6 @@
         </w:rPr>
         <w:t>‘</w:t>
       </w:r>
-      <w:proofErr w:type="gramEnd"/>
       <w:r>
         <w:rPr>
           <w:rFonts w:ascii="Courier New" w:hAnsi="Courier New"/>
@@ -2361,7 +1364,6 @@
         </w:rPr>
         <w:t>boots</w:t>
       </w:r>
-      <w:proofErr w:type="gramStart"/>
       <w:r>
         <w:rPr>
           <w:rFonts w:ascii="Courier New" w:hAnsi="Courier New"/>
@@ -2388,7 +1390,6 @@
         </w:rPr>
         <w:t>‘</w:t>
       </w:r>
-      <w:proofErr w:type="gramEnd"/>
       <w:r>
         <w:rPr>
           <w:rFonts w:ascii="Courier New" w:hAnsi="Courier New"/>
@@ -2397,7 +1398,6 @@
         </w:rPr>
         <w:t>helmet</w:t>
       </w:r>
-      <w:proofErr w:type="gramStart"/>
       <w:r>
         <w:rPr>
           <w:rFonts w:ascii="Courier New" w:hAnsi="Courier New"/>
@@ -2424,7 +1424,6 @@
         </w:rPr>
         <w:t>‘</w:t>
       </w:r>
-      <w:proofErr w:type="gramEnd"/>
       <w:r>
         <w:rPr>
           <w:rFonts w:ascii="Courier New" w:hAnsi="Courier New"/>
@@ -2470,25 +1469,7 @@
           <w:sz w:val="20"/>
           <w:szCs w:val="20"/>
         </w:rPr>
-        <w:t xml:space="preserve">brand: </w:t>
-      </w:r>
-      <w:proofErr w:type="gramStart"/>
-      <w:r>
-        <w:rPr>
-          <w:rFonts w:ascii="Courier New" w:hAnsi="Courier New"/>
-          <w:sz w:val="20"/>
-          <w:szCs w:val="20"/>
-        </w:rPr>
-        <w:t>VARCHAR(</w:t>
-      </w:r>
-      <w:proofErr w:type="gramEnd"/>
-      <w:r>
-        <w:rPr>
-          <w:rFonts w:ascii="Courier New" w:hAnsi="Courier New"/>
-          <w:sz w:val="20"/>
-          <w:szCs w:val="20"/>
-        </w:rPr>
-        <w:t>100), NOT NULL</w:t>
+        <w:t>brand: VARCHAR(100), NOT NULL</w:t>
       </w:r>
     </w:p>
     <w:p>
@@ -2510,25 +1491,7 @@
           <w:sz w:val="20"/>
           <w:szCs w:val="20"/>
         </w:rPr>
-        <w:t xml:space="preserve">model: </w:t>
-      </w:r>
-      <w:proofErr w:type="gramStart"/>
-      <w:r>
-        <w:rPr>
-          <w:rFonts w:ascii="Courier New" w:hAnsi="Courier New"/>
-          <w:sz w:val="20"/>
-          <w:szCs w:val="20"/>
-        </w:rPr>
-        <w:t>VARCHAR(</w:t>
-      </w:r>
-      <w:proofErr w:type="gramEnd"/>
-      <w:r>
-        <w:rPr>
-          <w:rFonts w:ascii="Courier New" w:hAnsi="Courier New"/>
-          <w:sz w:val="20"/>
-          <w:szCs w:val="20"/>
-        </w:rPr>
-        <w:t>100), NOT NULL</w:t>
+        <w:t>model: VARCHAR(100), NOT NULL</w:t>
       </w:r>
     </w:p>
     <w:p>
@@ -2544,41 +1507,13 @@
           <w:szCs w:val="20"/>
         </w:rPr>
       </w:pPr>
-      <w:proofErr w:type="spellStart"/>
-      <w:r>
-        <w:rPr>
-          <w:rFonts w:ascii="Courier New" w:hAnsi="Courier New"/>
-          <w:sz w:val="20"/>
-          <w:szCs w:val="20"/>
-        </w:rPr>
-        <w:t>serial_number</w:t>
-      </w:r>
-      <w:proofErr w:type="spellEnd"/>
-      <w:r>
-        <w:rPr>
-          <w:rFonts w:ascii="Courier New" w:hAnsi="Courier New"/>
-          <w:sz w:val="20"/>
-          <w:szCs w:val="20"/>
-        </w:rPr>
-        <w:t xml:space="preserve">: </w:t>
-      </w:r>
-      <w:proofErr w:type="gramStart"/>
-      <w:r>
-        <w:rPr>
-          <w:rFonts w:ascii="Courier New" w:hAnsi="Courier New"/>
-          <w:sz w:val="20"/>
-          <w:szCs w:val="20"/>
-        </w:rPr>
-        <w:t>VARCHAR(</w:t>
-      </w:r>
-      <w:proofErr w:type="gramEnd"/>
-      <w:r>
-        <w:rPr>
-          <w:rFonts w:ascii="Courier New" w:hAnsi="Courier New"/>
-          <w:sz w:val="20"/>
-          <w:szCs w:val="20"/>
-        </w:rPr>
-        <w:t>100), UNIQUE, NOT NULL</w:t>
+      <w:r>
+        <w:rPr>
+          <w:rFonts w:ascii="Courier New" w:hAnsi="Courier New"/>
+          <w:sz w:val="20"/>
+          <w:szCs w:val="20"/>
+        </w:rPr>
+        <w:t>serial_number: VARCHAR(100), UNIQUE, NOT NULL</w:t>
       </w:r>
     </w:p>
     <w:p>
@@ -2600,25 +1535,7 @@
           <w:sz w:val="20"/>
           <w:szCs w:val="20"/>
         </w:rPr>
-        <w:t xml:space="preserve">size: </w:t>
-      </w:r>
-      <w:proofErr w:type="gramStart"/>
-      <w:r>
-        <w:rPr>
-          <w:rFonts w:ascii="Courier New" w:hAnsi="Courier New"/>
-          <w:sz w:val="20"/>
-          <w:szCs w:val="20"/>
-        </w:rPr>
-        <w:t>VARCHAR(</w:t>
-      </w:r>
-      <w:proofErr w:type="gramEnd"/>
-      <w:r>
-        <w:rPr>
-          <w:rFonts w:ascii="Courier New" w:hAnsi="Courier New"/>
-          <w:sz w:val="20"/>
-          <w:szCs w:val="20"/>
-        </w:rPr>
-        <w:t>20), NOT NULL</w:t>
+        <w:t>size: VARCHAR(20), NOT NULL</w:t>
       </w:r>
     </w:p>
     <w:p>
@@ -2635,8 +1552,6 @@
           <w:lang w:val="fr-FR"/>
         </w:rPr>
       </w:pPr>
-      <w:proofErr w:type="spellStart"/>
-      <w:proofErr w:type="gramStart"/>
       <w:r>
         <w:rPr>
           <w:rFonts w:ascii="Courier New" w:hAnsi="Courier New"/>
@@ -2644,9 +1559,85 @@
           <w:szCs w:val="20"/>
           <w:lang w:val="fr-FR"/>
         </w:rPr>
-        <w:t>condition</w:t>
-      </w:r>
-      <w:proofErr w:type="gramEnd"/>
+        <w:t>condition_grade: ENUM(</w:t>
+      </w:r>
+      <w:r>
+        <w:rPr>
+          <w:rFonts w:ascii="Courier New" w:hAnsi="Courier New"/>
+          <w:sz w:val="20"/>
+          <w:szCs w:val="20"/>
+          <w:rtl/>
+        </w:rPr>
+        <w:t>‘</w:t>
+      </w:r>
+      <w:r>
+        <w:rPr>
+          <w:rFonts w:ascii="Courier New" w:hAnsi="Courier New"/>
+          <w:sz w:val="20"/>
+          <w:szCs w:val="20"/>
+        </w:rPr>
+        <w:t>new</w:t>
+      </w:r>
+      <w:r>
+        <w:rPr>
+          <w:rFonts w:ascii="Courier New" w:hAnsi="Courier New"/>
+          <w:sz w:val="20"/>
+          <w:szCs w:val="20"/>
+          <w:rtl/>
+        </w:rPr>
+        <w:t>’</w:t>
+      </w:r>
+      <w:r>
+        <w:rPr>
+          <w:rFonts w:ascii="Courier New" w:hAnsi="Courier New"/>
+          <w:sz w:val="20"/>
+          <w:szCs w:val="20"/>
+        </w:rPr>
+        <w:t xml:space="preserve">, </w:t>
+      </w:r>
+      <w:r>
+        <w:rPr>
+          <w:rFonts w:ascii="Courier New" w:hAnsi="Courier New"/>
+          <w:sz w:val="20"/>
+          <w:szCs w:val="20"/>
+          <w:rtl/>
+        </w:rPr>
+        <w:t>‘</w:t>
+      </w:r>
+      <w:r>
+        <w:rPr>
+          <w:rFonts w:ascii="Courier New" w:hAnsi="Courier New"/>
+          <w:sz w:val="20"/>
+          <w:szCs w:val="20"/>
+        </w:rPr>
+        <w:t>good</w:t>
+      </w:r>
+      <w:r>
+        <w:rPr>
+          <w:rFonts w:ascii="Courier New" w:hAnsi="Courier New"/>
+          <w:sz w:val="20"/>
+          <w:szCs w:val="20"/>
+          <w:rtl/>
+        </w:rPr>
+        <w:t>’</w:t>
+      </w:r>
+      <w:r>
+        <w:rPr>
+          <w:rFonts w:ascii="Courier New" w:hAnsi="Courier New"/>
+          <w:sz w:val="20"/>
+          <w:szCs w:val="20"/>
+        </w:rPr>
+        <w:t xml:space="preserve">, </w:t>
+      </w:r>
+      <w:r>
+        <w:rPr>
+          <w:rFonts w:ascii="Courier New" w:hAnsi="Courier New"/>
+          <w:sz w:val="20"/>
+          <w:szCs w:val="20"/>
+          <w:rtl/>
+        </w:rPr>
+        <w:t>‘</w:t>
+      </w:r>
       <w:r>
         <w:rPr>
           <w:rFonts w:ascii="Courier New" w:hAnsi="Courier New"/>
@@ -2654,49 +1645,8 @@
           <w:szCs w:val="20"/>
           <w:lang w:val="fr-FR"/>
         </w:rPr>
-        <w:t>_</w:t>
-      </w:r>
-      <w:proofErr w:type="gramStart"/>
-      <w:r>
-        <w:rPr>
-          <w:rFonts w:ascii="Courier New" w:hAnsi="Courier New"/>
-          <w:sz w:val="20"/>
-          <w:szCs w:val="20"/>
-          <w:lang w:val="fr-FR"/>
-        </w:rPr>
-        <w:t>grade</w:t>
-      </w:r>
-      <w:proofErr w:type="spellEnd"/>
-      <w:r>
-        <w:rPr>
-          <w:rFonts w:ascii="Courier New" w:hAnsi="Courier New"/>
-          <w:sz w:val="20"/>
-          <w:szCs w:val="20"/>
-          <w:lang w:val="fr-FR"/>
-        </w:rPr>
-        <w:t>:</w:t>
-      </w:r>
-      <w:proofErr w:type="gramEnd"/>
-      <w:r>
-        <w:rPr>
-          <w:rFonts w:ascii="Courier New" w:hAnsi="Courier New"/>
-          <w:sz w:val="20"/>
-          <w:szCs w:val="20"/>
-          <w:lang w:val="fr-FR"/>
-        </w:rPr>
-        <w:t xml:space="preserve"> </w:t>
-      </w:r>
-      <w:proofErr w:type="gramStart"/>
-      <w:r>
-        <w:rPr>
-          <w:rFonts w:ascii="Courier New" w:hAnsi="Courier New"/>
-          <w:sz w:val="20"/>
-          <w:szCs w:val="20"/>
-          <w:lang w:val="fr-FR"/>
-        </w:rPr>
-        <w:t>ENUM(</w:t>
-      </w:r>
-      <w:proofErr w:type="gramEnd"/>
+        <w:t>fair</w:t>
+      </w:r>
       <w:r>
         <w:rPr>
           <w:rFonts w:ascii="Courier New" w:hAnsi="Courier New"/>
@@ -2704,6 +1654,23 @@
           <w:szCs w:val="20"/>
           <w:rtl/>
         </w:rPr>
+        <w:t>’</w:t>
+      </w:r>
+      <w:r>
+        <w:rPr>
+          <w:rFonts w:ascii="Courier New" w:hAnsi="Courier New"/>
+          <w:sz w:val="20"/>
+          <w:szCs w:val="20"/>
+        </w:rPr>
+        <w:t xml:space="preserve">, </w:t>
+      </w:r>
+      <w:r>
+        <w:rPr>
+          <w:rFonts w:ascii="Courier New" w:hAnsi="Courier New"/>
+          <w:sz w:val="20"/>
+          <w:szCs w:val="20"/>
+          <w:rtl/>
+        </w:rPr>
         <w:t>‘</w:t>
       </w:r>
       <w:r>
@@ -2712,115 +1679,8 @@
           <w:sz w:val="20"/>
           <w:szCs w:val="20"/>
         </w:rPr>
-        <w:t>new</w:t>
-      </w:r>
-      <w:r>
-        <w:rPr>
-          <w:rFonts w:ascii="Courier New" w:hAnsi="Courier New"/>
-          <w:sz w:val="20"/>
-          <w:szCs w:val="20"/>
-          <w:rtl/>
-        </w:rPr>
-        <w:t>’</w:t>
-      </w:r>
-      <w:r>
-        <w:rPr>
-          <w:rFonts w:ascii="Courier New" w:hAnsi="Courier New"/>
-          <w:sz w:val="20"/>
-          <w:szCs w:val="20"/>
-        </w:rPr>
-        <w:t xml:space="preserve">, </w:t>
-      </w:r>
-      <w:r>
-        <w:rPr>
-          <w:rFonts w:ascii="Courier New" w:hAnsi="Courier New"/>
-          <w:sz w:val="20"/>
-          <w:szCs w:val="20"/>
-          <w:rtl/>
-        </w:rPr>
-        <w:t>‘</w:t>
-      </w:r>
-      <w:r>
-        <w:rPr>
-          <w:rFonts w:ascii="Courier New" w:hAnsi="Courier New"/>
-          <w:sz w:val="20"/>
-          <w:szCs w:val="20"/>
-        </w:rPr>
-        <w:t>good</w:t>
-      </w:r>
-      <w:r>
-        <w:rPr>
-          <w:rFonts w:ascii="Courier New" w:hAnsi="Courier New"/>
-          <w:sz w:val="20"/>
-          <w:szCs w:val="20"/>
-          <w:rtl/>
-        </w:rPr>
-        <w:t>’</w:t>
-      </w:r>
-      <w:r>
-        <w:rPr>
-          <w:rFonts w:ascii="Courier New" w:hAnsi="Courier New"/>
-          <w:sz w:val="20"/>
-          <w:szCs w:val="20"/>
-        </w:rPr>
-        <w:t xml:space="preserve">, </w:t>
-      </w:r>
-      <w:r>
-        <w:rPr>
-          <w:rFonts w:ascii="Courier New" w:hAnsi="Courier New"/>
-          <w:sz w:val="20"/>
-          <w:szCs w:val="20"/>
-          <w:rtl/>
-        </w:rPr>
-        <w:t>‘</w:t>
-      </w:r>
-      <w:proofErr w:type="spellStart"/>
-      <w:r>
-        <w:rPr>
-          <w:rFonts w:ascii="Courier New" w:hAnsi="Courier New"/>
-          <w:sz w:val="20"/>
-          <w:szCs w:val="20"/>
-          <w:lang w:val="fr-FR"/>
-        </w:rPr>
-        <w:t>fair</w:t>
-      </w:r>
-      <w:proofErr w:type="spellEnd"/>
-      <w:r>
-        <w:rPr>
-          <w:rFonts w:ascii="Courier New" w:hAnsi="Courier New"/>
-          <w:sz w:val="20"/>
-          <w:szCs w:val="20"/>
-          <w:rtl/>
-        </w:rPr>
-        <w:t>’</w:t>
-      </w:r>
-      <w:r>
-        <w:rPr>
-          <w:rFonts w:ascii="Courier New" w:hAnsi="Courier New"/>
-          <w:sz w:val="20"/>
-          <w:szCs w:val="20"/>
-        </w:rPr>
-        <w:t xml:space="preserve">, </w:t>
-      </w:r>
-      <w:r>
-        <w:rPr>
-          <w:rFonts w:ascii="Courier New" w:hAnsi="Courier New"/>
-          <w:sz w:val="20"/>
-          <w:szCs w:val="20"/>
-          <w:rtl/>
-        </w:rPr>
-        <w:t>‘</w:t>
-      </w:r>
-      <w:proofErr w:type="spellStart"/>
-      <w:r>
-        <w:rPr>
-          <w:rFonts w:ascii="Courier New" w:hAnsi="Courier New"/>
-          <w:sz w:val="20"/>
-          <w:szCs w:val="20"/>
-        </w:rPr>
         <w:t>needs_repair</w:t>
       </w:r>
-      <w:proofErr w:type="spellEnd"/>
       <w:r>
         <w:rPr>
           <w:rFonts w:ascii="Courier New" w:hAnsi="Courier New"/>
@@ -2939,7 +1799,6 @@
         </w:rPr>
         <w:t>‘</w:t>
       </w:r>
-      <w:proofErr w:type="spellStart"/>
       <w:r>
         <w:rPr>
           <w:rFonts w:ascii="Courier New" w:hAnsi="Courier New"/>
@@ -2948,7 +1807,6 @@
         </w:rPr>
         <w:t>in_service</w:t>
       </w:r>
-      <w:proofErr w:type="spellEnd"/>
       <w:r>
         <w:rPr>
           <w:rFonts w:ascii="Courier New" w:hAnsi="Courier New"/>
@@ -3014,23 +1872,13 @@
           <w:szCs w:val="20"/>
         </w:rPr>
       </w:pPr>
-      <w:proofErr w:type="spellStart"/>
-      <w:r>
-        <w:rPr>
-          <w:rFonts w:ascii="Courier New" w:hAnsi="Courier New"/>
-          <w:sz w:val="20"/>
-          <w:szCs w:val="20"/>
-        </w:rPr>
-        <w:t>acquired_at</w:t>
-      </w:r>
-      <w:proofErr w:type="spellEnd"/>
-      <w:r>
-        <w:rPr>
-          <w:rFonts w:ascii="Courier New" w:hAnsi="Courier New"/>
-          <w:sz w:val="20"/>
-          <w:szCs w:val="20"/>
-        </w:rPr>
-        <w:t>: DATETIME, NOT NULL</w:t>
+      <w:r>
+        <w:rPr>
+          <w:rFonts w:ascii="Courier New" w:hAnsi="Courier New"/>
+          <w:sz w:val="20"/>
+          <w:szCs w:val="20"/>
+        </w:rPr>
+        <w:t>acquired_at: DATETIME, NOT NULL</w:t>
       </w:r>
     </w:p>
     <w:p>
@@ -3057,13 +1905,8 @@
         </w:numPr>
       </w:pPr>
       <w:r>
-        <w:t xml:space="preserve">Many-to-many (M:M) relationship with </w:t>
-      </w:r>
-      <w:proofErr w:type="spellStart"/>
-      <w:r>
-        <w:t>rental_orders</w:t>
-      </w:r>
-      <w:proofErr w:type="spellEnd"/>
+        <w:t>Many-to-many (M:M) relationship with rental_orders</w:t>
+      </w:r>
     </w:p>
     <w:p>
       <w:pPr>
@@ -3074,13 +1917,8 @@
         </w:numPr>
       </w:pPr>
       <w:r>
-        <w:t xml:space="preserve">Many-to-many (M:M) relationship with </w:t>
-      </w:r>
-      <w:proofErr w:type="spellStart"/>
-      <w:r>
-        <w:t>service_tickets</w:t>
-      </w:r>
-      <w:proofErr w:type="spellEnd"/>
+        <w:t>Many-to-many (M:M) relationship with service_tickets</w:t>
+      </w:r>
     </w:p>
     <w:p>
       <w:pPr>
@@ -3095,7 +1933,6 @@
           <w:numId w:val="9"/>
         </w:numPr>
       </w:pPr>
-      <w:proofErr w:type="spellStart"/>
       <w:r>
         <w:rPr>
           <w:rFonts w:ascii="Courier New" w:hAnsi="Courier New"/>
@@ -3104,7 +1941,6 @@
         </w:rPr>
         <w:t>rental_orders</w:t>
       </w:r>
-      <w:proofErr w:type="spellEnd"/>
       <w:r>
         <w:t>: Records each rental checkout transaction.</w:t>
       </w:r>
@@ -3136,23 +1972,13 @@
           <w:szCs w:val="20"/>
         </w:rPr>
       </w:pPr>
-      <w:proofErr w:type="spellStart"/>
-      <w:r>
-        <w:rPr>
-          <w:rFonts w:ascii="Courier New" w:hAnsi="Courier New"/>
-          <w:sz w:val="20"/>
-          <w:szCs w:val="20"/>
-        </w:rPr>
-        <w:t>rental_order_id</w:t>
-      </w:r>
-      <w:proofErr w:type="spellEnd"/>
-      <w:r>
-        <w:rPr>
-          <w:rFonts w:ascii="Courier New" w:hAnsi="Courier New"/>
-          <w:sz w:val="20"/>
-          <w:szCs w:val="20"/>
-        </w:rPr>
-        <w:t>: INT, AUTO_INCREMENT, PRIMARY KEY, NOT NULL</w:t>
+      <w:r>
+        <w:rPr>
+          <w:rFonts w:ascii="Courier New" w:hAnsi="Courier New"/>
+          <w:sz w:val="20"/>
+          <w:szCs w:val="20"/>
+        </w:rPr>
+        <w:t>rental_order_id: INT, AUTO_INCREMENT, PRIMARY KEY, NOT NULL</w:t>
       </w:r>
     </w:p>
     <w:p>
@@ -3168,41 +1994,13 @@
           <w:szCs w:val="20"/>
         </w:rPr>
       </w:pPr>
-      <w:proofErr w:type="spellStart"/>
-      <w:r>
-        <w:rPr>
-          <w:rFonts w:ascii="Courier New" w:hAnsi="Courier New"/>
-          <w:sz w:val="20"/>
-          <w:szCs w:val="20"/>
-        </w:rPr>
-        <w:t>customer_id</w:t>
-      </w:r>
-      <w:proofErr w:type="spellEnd"/>
-      <w:r>
-        <w:rPr>
-          <w:rFonts w:ascii="Courier New" w:hAnsi="Courier New"/>
-          <w:sz w:val="20"/>
-          <w:szCs w:val="20"/>
-        </w:rPr>
-        <w:t>: INT, NOT NULL, FOREIGN KEY → customers(</w:t>
-      </w:r>
-      <w:proofErr w:type="spellStart"/>
-      <w:r>
-        <w:rPr>
-          <w:rFonts w:ascii="Courier New" w:hAnsi="Courier New"/>
-          <w:sz w:val="20"/>
-          <w:szCs w:val="20"/>
-        </w:rPr>
-        <w:t>customer_id</w:t>
-      </w:r>
-      <w:proofErr w:type="spellEnd"/>
-      <w:r>
-        <w:rPr>
-          <w:rFonts w:ascii="Courier New" w:hAnsi="Courier New"/>
-          <w:sz w:val="20"/>
-          <w:szCs w:val="20"/>
-        </w:rPr>
-        <w:t>)</w:t>
+      <w:r>
+        <w:rPr>
+          <w:rFonts w:ascii="Courier New" w:hAnsi="Courier New"/>
+          <w:sz w:val="20"/>
+          <w:szCs w:val="20"/>
+        </w:rPr>
+        <w:t>customer_id: INT, NOT NULL, FOREIGN KEY → customers(customer_id)</w:t>
       </w:r>
     </w:p>
     <w:p>
@@ -3218,42 +2016,13 @@
           <w:szCs w:val="20"/>
         </w:rPr>
       </w:pPr>
-      <w:proofErr w:type="spellStart"/>
-      <w:r>
-        <w:rPr>
-          <w:rFonts w:ascii="Courier New" w:hAnsi="Courier New"/>
-          <w:sz w:val="20"/>
-          <w:szCs w:val="20"/>
-        </w:rPr>
-        <w:lastRenderedPageBreak/>
-        <w:t>created_by_employee_id</w:t>
-      </w:r>
-      <w:proofErr w:type="spellEnd"/>
-      <w:r>
-        <w:rPr>
-          <w:rFonts w:ascii="Courier New" w:hAnsi="Courier New"/>
-          <w:sz w:val="20"/>
-          <w:szCs w:val="20"/>
-        </w:rPr>
-        <w:t>: INT, NOT NULL, FOREIGN KEY → employees(</w:t>
-      </w:r>
-      <w:proofErr w:type="spellStart"/>
-      <w:r>
-        <w:rPr>
-          <w:rFonts w:ascii="Courier New" w:hAnsi="Courier New"/>
-          <w:sz w:val="20"/>
-          <w:szCs w:val="20"/>
-        </w:rPr>
-        <w:t>employee_id</w:t>
-      </w:r>
-      <w:proofErr w:type="spellEnd"/>
-      <w:r>
-        <w:rPr>
-          <w:rFonts w:ascii="Courier New" w:hAnsi="Courier New"/>
-          <w:sz w:val="20"/>
-          <w:szCs w:val="20"/>
-        </w:rPr>
-        <w:t>)</w:t>
+      <w:r>
+        <w:rPr>
+          <w:rFonts w:ascii="Courier New" w:hAnsi="Courier New"/>
+          <w:sz w:val="20"/>
+          <w:szCs w:val="20"/>
+        </w:rPr>
+        <w:t>created_by_employee_id: INT, NOT NULL, FOREIGN KEY → employees(employee_id)</w:t>
       </w:r>
     </w:p>
     <w:p>
@@ -3269,23 +2038,14 @@
           <w:szCs w:val="20"/>
         </w:rPr>
       </w:pPr>
-      <w:proofErr w:type="spellStart"/>
-      <w:r>
-        <w:rPr>
-          <w:rFonts w:ascii="Courier New" w:hAnsi="Courier New"/>
-          <w:sz w:val="20"/>
-          <w:szCs w:val="20"/>
-        </w:rPr>
-        <w:t>created_at</w:t>
-      </w:r>
-      <w:proofErr w:type="spellEnd"/>
-      <w:r>
-        <w:rPr>
-          <w:rFonts w:ascii="Courier New" w:hAnsi="Courier New"/>
-          <w:sz w:val="20"/>
-          <w:szCs w:val="20"/>
-        </w:rPr>
-        <w:t>: DATETIME, NOT NULL</w:t>
+      <w:r>
+        <w:rPr>
+          <w:rFonts w:ascii="Courier New" w:hAnsi="Courier New"/>
+          <w:sz w:val="20"/>
+          <w:szCs w:val="20"/>
+        </w:rPr>
+        <w:lastRenderedPageBreak/>
+        <w:t>created_at: DATETIME, NOT NULL</w:t>
       </w:r>
     </w:p>
     <w:p>
@@ -3336,23 +2096,7 @@
         </w:numPr>
       </w:pPr>
       <w:r>
-        <w:t xml:space="preserve">Many-to-many (M:M) relationship with </w:t>
-      </w:r>
-      <w:proofErr w:type="spellStart"/>
-      <w:r>
-        <w:t>gear_items</w:t>
-      </w:r>
-      <w:proofErr w:type="spellEnd"/>
-      <w:r>
-        <w:t xml:space="preserve"> (via </w:t>
-      </w:r>
-      <w:proofErr w:type="spellStart"/>
-      <w:r>
-        <w:t>rental_order_items</w:t>
-      </w:r>
-      <w:proofErr w:type="spellEnd"/>
-      <w:r>
-        <w:t>)</w:t>
+        <w:t>Many-to-many (M:M) relationship with gear_items (via rental_order_items)</w:t>
       </w:r>
     </w:p>
     <w:p>
@@ -3368,7 +2112,6 @@
           <w:numId w:val="11"/>
         </w:numPr>
       </w:pPr>
-      <w:proofErr w:type="spellStart"/>
       <w:r>
         <w:rPr>
           <w:rFonts w:ascii="Courier New" w:hAnsi="Courier New"/>
@@ -3377,7 +2120,6 @@
         </w:rPr>
         <w:t>service_tickets</w:t>
       </w:r>
-      <w:proofErr w:type="spellEnd"/>
       <w:r>
         <w:t>: Records maintenance and repair work performed on gear items.</w:t>
       </w:r>
@@ -3409,23 +2151,13 @@
           <w:szCs w:val="20"/>
         </w:rPr>
       </w:pPr>
-      <w:proofErr w:type="spellStart"/>
-      <w:r>
-        <w:rPr>
-          <w:rFonts w:ascii="Courier New" w:hAnsi="Courier New"/>
-          <w:sz w:val="20"/>
-          <w:szCs w:val="20"/>
-        </w:rPr>
-        <w:t>service_ticket_id</w:t>
-      </w:r>
-      <w:proofErr w:type="spellEnd"/>
-      <w:r>
-        <w:rPr>
-          <w:rFonts w:ascii="Courier New" w:hAnsi="Courier New"/>
-          <w:sz w:val="20"/>
-          <w:szCs w:val="20"/>
-        </w:rPr>
-        <w:t>: INT, AUTO_INCREMENT, PRIMARY KEY, NOT NULL</w:t>
+      <w:r>
+        <w:rPr>
+          <w:rFonts w:ascii="Courier New" w:hAnsi="Courier New"/>
+          <w:sz w:val="20"/>
+          <w:szCs w:val="20"/>
+        </w:rPr>
+        <w:t>service_ticket_id: INT, AUTO_INCREMENT, PRIMARY KEY, NOT NULL</w:t>
       </w:r>
     </w:p>
     <w:p>
@@ -3441,41 +2173,13 @@
           <w:szCs w:val="20"/>
         </w:rPr>
       </w:pPr>
-      <w:proofErr w:type="spellStart"/>
-      <w:r>
-        <w:rPr>
-          <w:rFonts w:ascii="Courier New" w:hAnsi="Courier New"/>
-          <w:sz w:val="20"/>
-          <w:szCs w:val="20"/>
-        </w:rPr>
-        <w:t>opened_by_employee_id</w:t>
-      </w:r>
-      <w:proofErr w:type="spellEnd"/>
-      <w:r>
-        <w:rPr>
-          <w:rFonts w:ascii="Courier New" w:hAnsi="Courier New"/>
-          <w:sz w:val="20"/>
-          <w:szCs w:val="20"/>
-        </w:rPr>
-        <w:t>: INT, NOT NULL, FOREIGN KEY → employees(</w:t>
-      </w:r>
-      <w:proofErr w:type="spellStart"/>
-      <w:r>
-        <w:rPr>
-          <w:rFonts w:ascii="Courier New" w:hAnsi="Courier New"/>
-          <w:sz w:val="20"/>
-          <w:szCs w:val="20"/>
-        </w:rPr>
-        <w:t>employee_id</w:t>
-      </w:r>
-      <w:proofErr w:type="spellEnd"/>
-      <w:r>
-        <w:rPr>
-          <w:rFonts w:ascii="Courier New" w:hAnsi="Courier New"/>
-          <w:sz w:val="20"/>
-          <w:szCs w:val="20"/>
-        </w:rPr>
-        <w:t>)</w:t>
+      <w:r>
+        <w:rPr>
+          <w:rFonts w:ascii="Courier New" w:hAnsi="Courier New"/>
+          <w:sz w:val="20"/>
+          <w:szCs w:val="20"/>
+        </w:rPr>
+        <w:t>opened_by_employee_id: INT, NOT NULL, FOREIGN KEY → employees(employee_id)</w:t>
       </w:r>
     </w:p>
     <w:p>
@@ -3545,7 +2249,6 @@
         </w:rPr>
         <w:t>‘</w:t>
       </w:r>
-      <w:proofErr w:type="spellStart"/>
       <w:r>
         <w:rPr>
           <w:rFonts w:ascii="Courier New" w:hAnsi="Courier New"/>
@@ -3554,7 +2257,6 @@
         </w:rPr>
         <w:t>in_progress</w:t>
       </w:r>
-      <w:proofErr w:type="spellEnd"/>
       <w:r>
         <w:rPr>
           <w:rFonts w:ascii="Courier New" w:hAnsi="Courier New"/>
@@ -3654,23 +2356,13 @@
           <w:szCs w:val="20"/>
         </w:rPr>
       </w:pPr>
-      <w:proofErr w:type="spellStart"/>
-      <w:r>
-        <w:rPr>
-          <w:rFonts w:ascii="Courier New" w:hAnsi="Courier New"/>
-          <w:sz w:val="20"/>
-          <w:szCs w:val="20"/>
-        </w:rPr>
-        <w:t>created_at</w:t>
-      </w:r>
-      <w:proofErr w:type="spellEnd"/>
-      <w:r>
-        <w:rPr>
-          <w:rFonts w:ascii="Courier New" w:hAnsi="Courier New"/>
-          <w:sz w:val="20"/>
-          <w:szCs w:val="20"/>
-        </w:rPr>
-        <w:t>: DATETIME, NOT NULL</w:t>
+      <w:r>
+        <w:rPr>
+          <w:rFonts w:ascii="Courier New" w:hAnsi="Courier New"/>
+          <w:sz w:val="20"/>
+          <w:szCs w:val="20"/>
+        </w:rPr>
+        <w:t>created_at: DATETIME, NOT NULL</w:t>
       </w:r>
     </w:p>
     <w:p>
@@ -3738,39 +2430,7 @@
           <w:sz w:val="20"/>
           <w:szCs w:val="20"/>
         </w:rPr>
-        <w:t xml:space="preserve">Many-to-many (M:M) relationship with </w:t>
-      </w:r>
-      <w:proofErr w:type="spellStart"/>
-      <w:r>
-        <w:rPr>
-          <w:sz w:val="20"/>
-          <w:szCs w:val="20"/>
-        </w:rPr>
-        <w:t>gear_items</w:t>
-      </w:r>
-      <w:proofErr w:type="spellEnd"/>
-      <w:r>
-        <w:rPr>
-          <w:sz w:val="20"/>
-          <w:szCs w:val="20"/>
-        </w:rPr>
-        <w:t xml:space="preserve"> (via </w:t>
-      </w:r>
-      <w:proofErr w:type="spellStart"/>
-      <w:r>
-        <w:rPr>
-          <w:sz w:val="20"/>
-          <w:szCs w:val="20"/>
-        </w:rPr>
-        <w:t>service_ticket_items</w:t>
-      </w:r>
-      <w:proofErr w:type="spellEnd"/>
-      <w:r>
-        <w:rPr>
-          <w:sz w:val="20"/>
-          <w:szCs w:val="20"/>
-        </w:rPr>
-        <w:t>)</w:t>
+        <w:t>Many-to-many (M:M) relationship with gear_items (via service_ticket_items)</w:t>
       </w:r>
     </w:p>
     <w:p>
@@ -3837,7 +2497,6 @@
           <w:numId w:val="13"/>
         </w:numPr>
       </w:pPr>
-      <w:proofErr w:type="spellStart"/>
       <w:r>
         <w:rPr>
           <w:rFonts w:ascii="Courier New" w:hAnsi="Courier New"/>
@@ -3846,25 +2505,8 @@
         </w:rPr>
         <w:t>rental_order_items</w:t>
       </w:r>
-      <w:proofErr w:type="spellEnd"/>
-      <w:r>
-        <w:t xml:space="preserve">: Implements the many-to-many relationship between </w:t>
-      </w:r>
-      <w:proofErr w:type="spellStart"/>
-      <w:r>
-        <w:t>rental_orders</w:t>
-      </w:r>
-      <w:proofErr w:type="spellEnd"/>
-      <w:r>
-        <w:t xml:space="preserve"> and </w:t>
-      </w:r>
-      <w:proofErr w:type="spellStart"/>
-      <w:r>
-        <w:t>gear_items</w:t>
-      </w:r>
-      <w:proofErr w:type="spellEnd"/>
-      <w:r>
-        <w:t>.</w:t>
+      <w:r>
+        <w:t>: Implements the many-to-many relationship between rental_orders and gear_items.</w:t>
       </w:r>
     </w:p>
     <w:p>
@@ -3894,59 +2536,13 @@
           <w:szCs w:val="20"/>
         </w:rPr>
       </w:pPr>
-      <w:proofErr w:type="spellStart"/>
-      <w:r>
-        <w:rPr>
-          <w:rFonts w:ascii="Courier New" w:hAnsi="Courier New"/>
-          <w:sz w:val="20"/>
-          <w:szCs w:val="20"/>
-        </w:rPr>
-        <w:t>rental_order_id</w:t>
-      </w:r>
-      <w:proofErr w:type="spellEnd"/>
-      <w:r>
-        <w:rPr>
-          <w:rFonts w:ascii="Courier New" w:hAnsi="Courier New"/>
-          <w:sz w:val="20"/>
-          <w:szCs w:val="20"/>
-        </w:rPr>
-        <w:t xml:space="preserve">: INT, NOT NULL, FOREIGN KEY → </w:t>
-      </w:r>
-      <w:proofErr w:type="spellStart"/>
-      <w:r>
-        <w:rPr>
-          <w:rFonts w:ascii="Courier New" w:hAnsi="Courier New"/>
-          <w:sz w:val="20"/>
-          <w:szCs w:val="20"/>
-        </w:rPr>
-        <w:t>rental_orders</w:t>
-      </w:r>
-      <w:proofErr w:type="spellEnd"/>
-      <w:r>
-        <w:rPr>
-          <w:rFonts w:ascii="Courier New" w:hAnsi="Courier New"/>
-          <w:sz w:val="20"/>
-          <w:szCs w:val="20"/>
-        </w:rPr>
-        <w:t>(</w:t>
-      </w:r>
-      <w:proofErr w:type="spellStart"/>
-      <w:r>
-        <w:rPr>
-          <w:rFonts w:ascii="Courier New" w:hAnsi="Courier New"/>
-          <w:sz w:val="20"/>
-          <w:szCs w:val="20"/>
-        </w:rPr>
-        <w:t>rental_order_id</w:t>
-      </w:r>
-      <w:proofErr w:type="spellEnd"/>
-      <w:r>
-        <w:rPr>
-          <w:rFonts w:ascii="Courier New" w:hAnsi="Courier New"/>
-          <w:sz w:val="20"/>
-          <w:szCs w:val="20"/>
-        </w:rPr>
-        <w:t>)</w:t>
+      <w:r>
+        <w:rPr>
+          <w:rFonts w:ascii="Courier New" w:hAnsi="Courier New"/>
+          <w:sz w:val="20"/>
+          <w:szCs w:val="20"/>
+        </w:rPr>
+        <w:t>rental_order_id: INT, NOT NULL, FOREIGN KEY → rental_orders(rental_order_id)</w:t>
       </w:r>
     </w:p>
     <w:p>
@@ -3962,59 +2558,13 @@
           <w:szCs w:val="20"/>
         </w:rPr>
       </w:pPr>
-      <w:proofErr w:type="spellStart"/>
-      <w:r>
-        <w:rPr>
-          <w:rFonts w:ascii="Courier New" w:hAnsi="Courier New"/>
-          <w:sz w:val="20"/>
-          <w:szCs w:val="20"/>
-        </w:rPr>
-        <w:t>gear_item_id</w:t>
-      </w:r>
-      <w:proofErr w:type="spellEnd"/>
-      <w:r>
-        <w:rPr>
-          <w:rFonts w:ascii="Courier New" w:hAnsi="Courier New"/>
-          <w:sz w:val="20"/>
-          <w:szCs w:val="20"/>
-        </w:rPr>
-        <w:t xml:space="preserve">: INT, NOT NULL, FOREIGN KEY → </w:t>
-      </w:r>
-      <w:proofErr w:type="spellStart"/>
-      <w:r>
-        <w:rPr>
-          <w:rFonts w:ascii="Courier New" w:hAnsi="Courier New"/>
-          <w:sz w:val="20"/>
-          <w:szCs w:val="20"/>
-        </w:rPr>
-        <w:t>gear_items</w:t>
-      </w:r>
-      <w:proofErr w:type="spellEnd"/>
-      <w:r>
-        <w:rPr>
-          <w:rFonts w:ascii="Courier New" w:hAnsi="Courier New"/>
-          <w:sz w:val="20"/>
-          <w:szCs w:val="20"/>
-        </w:rPr>
-        <w:t>(</w:t>
-      </w:r>
-      <w:proofErr w:type="spellStart"/>
-      <w:r>
-        <w:rPr>
-          <w:rFonts w:ascii="Courier New" w:hAnsi="Courier New"/>
-          <w:sz w:val="20"/>
-          <w:szCs w:val="20"/>
-        </w:rPr>
-        <w:t>gear_item_id</w:t>
-      </w:r>
-      <w:proofErr w:type="spellEnd"/>
-      <w:r>
-        <w:rPr>
-          <w:rFonts w:ascii="Courier New" w:hAnsi="Courier New"/>
-          <w:sz w:val="20"/>
-          <w:szCs w:val="20"/>
-        </w:rPr>
-        <w:t>)</w:t>
+      <w:r>
+        <w:rPr>
+          <w:rFonts w:ascii="Courier New" w:hAnsi="Courier New"/>
+          <w:sz w:val="20"/>
+          <w:szCs w:val="20"/>
+        </w:rPr>
+        <w:t>gear_item_id: INT, NOT NULL, FOREIGN KEY → gear_items(gear_item_id)</w:t>
       </w:r>
     </w:p>
     <w:p>
@@ -4030,23 +2580,13 @@
           <w:szCs w:val="20"/>
         </w:rPr>
       </w:pPr>
-      <w:proofErr w:type="spellStart"/>
-      <w:r>
-        <w:rPr>
-          <w:rFonts w:ascii="Courier New" w:hAnsi="Courier New"/>
-          <w:sz w:val="20"/>
-          <w:szCs w:val="20"/>
-        </w:rPr>
-        <w:t>checked_out_at</w:t>
-      </w:r>
-      <w:proofErr w:type="spellEnd"/>
-      <w:r>
-        <w:rPr>
-          <w:rFonts w:ascii="Courier New" w:hAnsi="Courier New"/>
-          <w:sz w:val="20"/>
-          <w:szCs w:val="20"/>
-        </w:rPr>
-        <w:t>: DATETIME, NOT NULL</w:t>
+      <w:r>
+        <w:rPr>
+          <w:rFonts w:ascii="Courier New" w:hAnsi="Courier New"/>
+          <w:sz w:val="20"/>
+          <w:szCs w:val="20"/>
+        </w:rPr>
+        <w:t>checked_out_at: DATETIME, NOT NULL</w:t>
       </w:r>
     </w:p>
     <w:p>
@@ -4062,23 +2602,13 @@
           <w:szCs w:val="20"/>
         </w:rPr>
       </w:pPr>
-      <w:proofErr w:type="spellStart"/>
-      <w:r>
-        <w:rPr>
-          <w:rFonts w:ascii="Courier New" w:hAnsi="Courier New"/>
-          <w:sz w:val="20"/>
-          <w:szCs w:val="20"/>
-        </w:rPr>
-        <w:t>due_at</w:t>
-      </w:r>
-      <w:proofErr w:type="spellEnd"/>
-      <w:r>
-        <w:rPr>
-          <w:rFonts w:ascii="Courier New" w:hAnsi="Courier New"/>
-          <w:sz w:val="20"/>
-          <w:szCs w:val="20"/>
-        </w:rPr>
-        <w:t>: DATETIME, NOT NULL</w:t>
+      <w:r>
+        <w:rPr>
+          <w:rFonts w:ascii="Courier New" w:hAnsi="Courier New"/>
+          <w:sz w:val="20"/>
+          <w:szCs w:val="20"/>
+        </w:rPr>
+        <w:t>due_at: DATETIME, NOT NULL</w:t>
       </w:r>
     </w:p>
     <w:p>
@@ -4094,23 +2624,13 @@
           <w:szCs w:val="20"/>
         </w:rPr>
       </w:pPr>
-      <w:proofErr w:type="spellStart"/>
-      <w:r>
-        <w:rPr>
-          <w:rFonts w:ascii="Courier New" w:hAnsi="Courier New"/>
-          <w:sz w:val="20"/>
-          <w:szCs w:val="20"/>
-        </w:rPr>
-        <w:t>returned_at</w:t>
-      </w:r>
-      <w:proofErr w:type="spellEnd"/>
-      <w:r>
-        <w:rPr>
-          <w:rFonts w:ascii="Courier New" w:hAnsi="Courier New"/>
-          <w:sz w:val="20"/>
-          <w:szCs w:val="20"/>
-        </w:rPr>
-        <w:t>: DATETIME, NULL</w:t>
+      <w:r>
+        <w:rPr>
+          <w:rFonts w:ascii="Courier New" w:hAnsi="Courier New"/>
+          <w:sz w:val="20"/>
+          <w:szCs w:val="20"/>
+        </w:rPr>
+        <w:t>returned_at: DATETIME, NULL</w:t>
       </w:r>
     </w:p>
     <w:p>
@@ -4147,43 +2667,7 @@
           <w:sz w:val="20"/>
           <w:szCs w:val="20"/>
         </w:rPr>
-        <w:t>(</w:t>
-      </w:r>
-      <w:proofErr w:type="spellStart"/>
-      <w:r>
-        <w:rPr>
-          <w:rFonts w:ascii="Courier New" w:hAnsi="Courier New"/>
-          <w:sz w:val="20"/>
-          <w:szCs w:val="20"/>
-        </w:rPr>
-        <w:t>rental_order_id</w:t>
-      </w:r>
-      <w:proofErr w:type="spellEnd"/>
-      <w:r>
-        <w:rPr>
-          <w:rFonts w:ascii="Courier New" w:hAnsi="Courier New"/>
-          <w:sz w:val="20"/>
-          <w:szCs w:val="20"/>
-        </w:rPr>
-        <w:t xml:space="preserve">, </w:t>
-      </w:r>
-      <w:proofErr w:type="spellStart"/>
-      <w:r>
-        <w:rPr>
-          <w:rFonts w:ascii="Courier New" w:hAnsi="Courier New"/>
-          <w:sz w:val="20"/>
-          <w:szCs w:val="20"/>
-        </w:rPr>
-        <w:t>gear_item_id</w:t>
-      </w:r>
-      <w:proofErr w:type="spellEnd"/>
-      <w:r>
-        <w:rPr>
-          <w:rFonts w:ascii="Courier New" w:hAnsi="Courier New"/>
-          <w:sz w:val="20"/>
-          <w:szCs w:val="20"/>
-        </w:rPr>
-        <w:t>)</w:t>
+        <w:t>(rental_order_id, gear_item_id)</w:t>
       </w:r>
     </w:p>
     <w:p>
@@ -4217,28 +2701,7 @@
       </w:r>
       <w:r>
         <w:tab/>
-        <w:t xml:space="preserve">checking that </w:t>
-      </w:r>
-      <w:proofErr w:type="spellStart"/>
-      <w:r>
-        <w:t>gear_</w:t>
-      </w:r>
-      <w:proofErr w:type="gramStart"/>
-      <w:r>
-        <w:t>items.status</w:t>
-      </w:r>
-      <w:proofErr w:type="spellEnd"/>
-      <w:proofErr w:type="gramEnd"/>
-      <w:r>
-        <w:t xml:space="preserve"> = 'available' prior to checkout and updating the status to 'rented' while </w:t>
-      </w:r>
-      <w:proofErr w:type="spellStart"/>
-      <w:r>
-        <w:t>returned_at</w:t>
-      </w:r>
-      <w:proofErr w:type="spellEnd"/>
-      <w:r>
-        <w:t xml:space="preserve"> is NULL.</w:t>
+        <w:t>checking that gear_items.status = 'available' prior to checkout and updating the status to 'rented' while returned_at is NULL.</w:t>
       </w:r>
     </w:p>
     <w:p>
@@ -4254,7 +2717,6 @@
           <w:numId w:val="15"/>
         </w:numPr>
       </w:pPr>
-      <w:proofErr w:type="spellStart"/>
       <w:r>
         <w:rPr>
           <w:rFonts w:ascii="Courier New" w:hAnsi="Courier New"/>
@@ -4263,25 +2725,8 @@
         </w:rPr>
         <w:t>service_ticket_items</w:t>
       </w:r>
-      <w:proofErr w:type="spellEnd"/>
-      <w:r>
-        <w:t xml:space="preserve">: Implements the many-to-many relationship between </w:t>
-      </w:r>
-      <w:proofErr w:type="spellStart"/>
-      <w:r>
-        <w:t>service_tickets</w:t>
-      </w:r>
-      <w:proofErr w:type="spellEnd"/>
-      <w:r>
-        <w:t xml:space="preserve"> and </w:t>
-      </w:r>
-      <w:proofErr w:type="spellStart"/>
-      <w:r>
-        <w:t>gear_items</w:t>
-      </w:r>
-      <w:proofErr w:type="spellEnd"/>
-      <w:r>
-        <w:t>.</w:t>
+      <w:r>
+        <w:t>: Implements the many-to-many relationship between service_tickets and gear_items.</w:t>
       </w:r>
     </w:p>
     <w:p>
@@ -4312,59 +2757,14 @@
           <w:szCs w:val="20"/>
         </w:rPr>
       </w:pPr>
-      <w:proofErr w:type="spellStart"/>
-      <w:r>
-        <w:rPr>
-          <w:rFonts w:ascii="Courier New" w:hAnsi="Courier New"/>
-          <w:sz w:val="20"/>
-          <w:szCs w:val="20"/>
-        </w:rPr>
-        <w:t>service_ticket_id</w:t>
-      </w:r>
-      <w:proofErr w:type="spellEnd"/>
-      <w:r>
-        <w:rPr>
-          <w:rFonts w:ascii="Courier New" w:hAnsi="Courier New"/>
-          <w:sz w:val="20"/>
-          <w:szCs w:val="20"/>
-        </w:rPr>
-        <w:t xml:space="preserve">: INT, NOT NULL, FOREIGN KEY → </w:t>
-      </w:r>
-      <w:proofErr w:type="spellStart"/>
-      <w:r>
-        <w:rPr>
-          <w:rFonts w:ascii="Courier New" w:hAnsi="Courier New"/>
-          <w:sz w:val="20"/>
-          <w:szCs w:val="20"/>
-        </w:rPr>
-        <w:t>service_tickets</w:t>
-      </w:r>
-      <w:proofErr w:type="spellEnd"/>
-      <w:r>
-        <w:rPr>
-          <w:rFonts w:ascii="Courier New" w:hAnsi="Courier New"/>
-          <w:sz w:val="20"/>
-          <w:szCs w:val="20"/>
-        </w:rPr>
-        <w:t>(</w:t>
-      </w:r>
-      <w:proofErr w:type="spellStart"/>
-      <w:r>
-        <w:rPr>
-          <w:rFonts w:ascii="Courier New" w:hAnsi="Courier New"/>
-          <w:sz w:val="20"/>
-          <w:szCs w:val="20"/>
-        </w:rPr>
-        <w:t>service_ticket_id</w:t>
-      </w:r>
-      <w:proofErr w:type="spellEnd"/>
-      <w:r>
-        <w:rPr>
-          <w:rFonts w:ascii="Courier New" w:hAnsi="Courier New"/>
-          <w:sz w:val="20"/>
-          <w:szCs w:val="20"/>
-        </w:rPr>
-        <w:t>)</w:t>
+      <w:r>
+        <w:rPr>
+          <w:rFonts w:ascii="Courier New" w:hAnsi="Courier New"/>
+          <w:sz w:val="20"/>
+          <w:szCs w:val="20"/>
+        </w:rPr>
+        <w:lastRenderedPageBreak/>
+        <w:t>service_ticket_id: INT, NOT NULL, FOREIGN KEY → service_tickets(service_ticket_id)</w:t>
       </w:r>
     </w:p>
     <w:p>
@@ -4380,59 +2780,13 @@
           <w:szCs w:val="20"/>
         </w:rPr>
       </w:pPr>
-      <w:proofErr w:type="spellStart"/>
-      <w:r>
-        <w:rPr>
-          <w:rFonts w:ascii="Courier New" w:hAnsi="Courier New"/>
-          <w:sz w:val="20"/>
-          <w:szCs w:val="20"/>
-        </w:rPr>
-        <w:t>gear_item_id</w:t>
-      </w:r>
-      <w:proofErr w:type="spellEnd"/>
-      <w:r>
-        <w:rPr>
-          <w:rFonts w:ascii="Courier New" w:hAnsi="Courier New"/>
-          <w:sz w:val="20"/>
-          <w:szCs w:val="20"/>
-        </w:rPr>
-        <w:t xml:space="preserve">: INT, NOT NULL, FOREIGN KEY → </w:t>
-      </w:r>
-      <w:proofErr w:type="spellStart"/>
-      <w:r>
-        <w:rPr>
-          <w:rFonts w:ascii="Courier New" w:hAnsi="Courier New"/>
-          <w:sz w:val="20"/>
-          <w:szCs w:val="20"/>
-        </w:rPr>
-        <w:t>gear_items</w:t>
-      </w:r>
-      <w:proofErr w:type="spellEnd"/>
-      <w:r>
-        <w:rPr>
-          <w:rFonts w:ascii="Courier New" w:hAnsi="Courier New"/>
-          <w:sz w:val="20"/>
-          <w:szCs w:val="20"/>
-        </w:rPr>
-        <w:t>(</w:t>
-      </w:r>
-      <w:proofErr w:type="spellStart"/>
-      <w:r>
-        <w:rPr>
-          <w:rFonts w:ascii="Courier New" w:hAnsi="Courier New"/>
-          <w:sz w:val="20"/>
-          <w:szCs w:val="20"/>
-        </w:rPr>
-        <w:t>gear_item_id</w:t>
-      </w:r>
-      <w:proofErr w:type="spellEnd"/>
-      <w:r>
-        <w:rPr>
-          <w:rFonts w:ascii="Courier New" w:hAnsi="Courier New"/>
-          <w:sz w:val="20"/>
-          <w:szCs w:val="20"/>
-        </w:rPr>
-        <w:t>)</w:t>
+      <w:r>
+        <w:rPr>
+          <w:rFonts w:ascii="Courier New" w:hAnsi="Courier New"/>
+          <w:sz w:val="20"/>
+          <w:szCs w:val="20"/>
+        </w:rPr>
+        <w:t>gear_item_id: INT, NOT NULL, FOREIGN KEY → gear_items(gear_item_id)</w:t>
       </w:r>
     </w:p>
     <w:p>
@@ -4448,34 +2802,14 @@
           <w:szCs w:val="20"/>
         </w:rPr>
       </w:pPr>
-      <w:proofErr w:type="spellStart"/>
-      <w:r>
-        <w:rPr>
-          <w:rFonts w:ascii="Courier New" w:hAnsi="Courier New"/>
-          <w:sz w:val="20"/>
-          <w:szCs w:val="20"/>
-        </w:rPr>
-        <w:t>service_type</w:t>
-      </w:r>
-      <w:proofErr w:type="spellEnd"/>
-      <w:r>
-        <w:rPr>
-          <w:rFonts w:ascii="Courier New" w:hAnsi="Courier New"/>
-          <w:sz w:val="20"/>
-          <w:szCs w:val="20"/>
-        </w:rPr>
-        <w:t xml:space="preserve">: </w:t>
-      </w:r>
-      <w:proofErr w:type="gramStart"/>
-      <w:r>
-        <w:rPr>
-          <w:rFonts w:ascii="Courier New" w:hAnsi="Courier New"/>
-          <w:sz w:val="20"/>
-          <w:szCs w:val="20"/>
-        </w:rPr>
-        <w:t>ENUM(</w:t>
-      </w:r>
-      <w:proofErr w:type="gramEnd"/>
+      <w:r>
+        <w:rPr>
+          <w:rFonts w:ascii="Courier New" w:hAnsi="Courier New"/>
+          <w:sz w:val="20"/>
+          <w:szCs w:val="20"/>
+        </w:rPr>
+        <w:t>service_type: ENUM(</w:t>
+      </w:r>
       <w:r>
         <w:rPr>
           <w:rFonts w:ascii="Courier New" w:hAnsi="Courier New"/>
@@ -4493,7 +2827,6 @@
         </w:rPr>
         <w:t>wax</w:t>
       </w:r>
-      <w:proofErr w:type="gramStart"/>
       <w:r>
         <w:rPr>
           <w:rFonts w:ascii="Courier New" w:hAnsi="Courier New"/>
@@ -4520,7 +2853,6 @@
         </w:rPr>
         <w:t>‘</w:t>
       </w:r>
-      <w:proofErr w:type="gramEnd"/>
       <w:r>
         <w:rPr>
           <w:rFonts w:ascii="Courier New" w:hAnsi="Courier New"/>
@@ -4529,7 +2861,6 @@
         </w:rPr>
         <w:t>tune</w:t>
       </w:r>
-      <w:proofErr w:type="gramStart"/>
       <w:r>
         <w:rPr>
           <w:rFonts w:ascii="Courier New" w:hAnsi="Courier New"/>
@@ -4556,7 +2887,6 @@
         </w:rPr>
         <w:t>‘</w:t>
       </w:r>
-      <w:proofErr w:type="gramEnd"/>
       <w:r>
         <w:rPr>
           <w:rFonts w:ascii="Courier New" w:hAnsi="Courier New"/>
@@ -4565,7 +2895,6 @@
         </w:rPr>
         <w:t>repair</w:t>
       </w:r>
-      <w:proofErr w:type="gramStart"/>
       <w:r>
         <w:rPr>
           <w:rFonts w:ascii="Courier New" w:hAnsi="Courier New"/>
@@ -4592,8 +2921,6 @@
         </w:rPr>
         <w:t>‘</w:t>
       </w:r>
-      <w:proofErr w:type="spellStart"/>
-      <w:proofErr w:type="gramEnd"/>
       <w:r>
         <w:rPr>
           <w:rFonts w:ascii="Courier New" w:hAnsi="Courier New"/>
@@ -4602,8 +2929,6 @@
         </w:rPr>
         <w:t>binding_adjust</w:t>
       </w:r>
-      <w:proofErr w:type="spellEnd"/>
-      <w:proofErr w:type="gramStart"/>
       <w:r>
         <w:rPr>
           <w:rFonts w:ascii="Courier New" w:hAnsi="Courier New"/>
@@ -4630,7 +2955,6 @@
         </w:rPr>
         <w:t>‘</w:t>
       </w:r>
-      <w:proofErr w:type="gramEnd"/>
       <w:r>
         <w:rPr>
           <w:rFonts w:ascii="Courier New" w:hAnsi="Courier New"/>
@@ -4670,23 +2994,13 @@
           <w:szCs w:val="20"/>
         </w:rPr>
       </w:pPr>
-      <w:proofErr w:type="spellStart"/>
-      <w:r>
-        <w:rPr>
-          <w:rFonts w:ascii="Courier New" w:hAnsi="Courier New"/>
-          <w:sz w:val="20"/>
-          <w:szCs w:val="20"/>
-        </w:rPr>
-        <w:t>started_at</w:t>
-      </w:r>
-      <w:proofErr w:type="spellEnd"/>
-      <w:r>
-        <w:rPr>
-          <w:rFonts w:ascii="Courier New" w:hAnsi="Courier New"/>
-          <w:sz w:val="20"/>
-          <w:szCs w:val="20"/>
-        </w:rPr>
-        <w:t>: DATETIME, NULL</w:t>
+      <w:r>
+        <w:rPr>
+          <w:rFonts w:ascii="Courier New" w:hAnsi="Courier New"/>
+          <w:sz w:val="20"/>
+          <w:szCs w:val="20"/>
+        </w:rPr>
+        <w:t>started_at: DATETIME, NULL</w:t>
       </w:r>
     </w:p>
     <w:p>
@@ -4702,23 +3016,13 @@
           <w:szCs w:val="20"/>
         </w:rPr>
       </w:pPr>
-      <w:proofErr w:type="spellStart"/>
-      <w:r>
-        <w:rPr>
-          <w:rFonts w:ascii="Courier New" w:hAnsi="Courier New"/>
-          <w:sz w:val="20"/>
-          <w:szCs w:val="20"/>
-        </w:rPr>
-        <w:t>completed_at</w:t>
-      </w:r>
-      <w:proofErr w:type="spellEnd"/>
-      <w:r>
-        <w:rPr>
-          <w:rFonts w:ascii="Courier New" w:hAnsi="Courier New"/>
-          <w:sz w:val="20"/>
-          <w:szCs w:val="20"/>
-        </w:rPr>
-        <w:t>: DATETIME, NULL</w:t>
+      <w:r>
+        <w:rPr>
+          <w:rFonts w:ascii="Courier New" w:hAnsi="Courier New"/>
+          <w:sz w:val="20"/>
+          <w:szCs w:val="20"/>
+        </w:rPr>
+        <w:t>completed_at: DATETIME, NULL</w:t>
       </w:r>
     </w:p>
     <w:p>
@@ -4755,43 +3059,7 @@
           <w:sz w:val="20"/>
           <w:szCs w:val="20"/>
         </w:rPr>
-        <w:t>(</w:t>
-      </w:r>
-      <w:proofErr w:type="spellStart"/>
-      <w:r>
-        <w:rPr>
-          <w:rFonts w:ascii="Courier New" w:hAnsi="Courier New"/>
-          <w:sz w:val="20"/>
-          <w:szCs w:val="20"/>
-        </w:rPr>
-        <w:t>service_ticket_id</w:t>
-      </w:r>
-      <w:proofErr w:type="spellEnd"/>
-      <w:r>
-        <w:rPr>
-          <w:rFonts w:ascii="Courier New" w:hAnsi="Courier New"/>
-          <w:sz w:val="20"/>
-          <w:szCs w:val="20"/>
-        </w:rPr>
-        <w:t xml:space="preserve">, </w:t>
-      </w:r>
-      <w:proofErr w:type="spellStart"/>
-      <w:r>
-        <w:rPr>
-          <w:rFonts w:ascii="Courier New" w:hAnsi="Courier New"/>
-          <w:sz w:val="20"/>
-          <w:szCs w:val="20"/>
-        </w:rPr>
-        <w:t>gear_item_id</w:t>
-      </w:r>
-      <w:proofErr w:type="spellEnd"/>
-      <w:r>
-        <w:rPr>
-          <w:rFonts w:ascii="Courier New" w:hAnsi="Courier New"/>
-          <w:sz w:val="20"/>
-          <w:szCs w:val="20"/>
-        </w:rPr>
-        <w:t>)</w:t>
+        <w:t>(service_ticket_id, gear_item_id)</w:t>
       </w:r>
     </w:p>
     <w:p>
@@ -4822,7 +3090,7 @@
           <w:sz w:val="30"/>
           <w:szCs w:val="30"/>
         </w:rPr>
-        <w:t>h</w:t>
+        <w:t>i</w:t>
       </w:r>
       <w:r>
         <w:rPr>
@@ -4841,6 +3109,56 @@
       <w:pPr>
         <w:pStyle w:val="Body"/>
       </w:pPr>
+      <w:r>
+        <w:tab/>
+      </w:r>
+      <w:r>
+        <w:drawing>
+          <wp:inline distT="0" distB="0" distL="0" distR="0" wp14:anchorId="47539668" wp14:editId="3631A586">
+            <wp:extent cx="5943600" cy="3372485"/>
+            <wp:effectExtent l="0" t="0" r="0" b="0"/>
+            <wp:docPr id="1540196227" name="Picture 1"/>
+            <wp:cNvGraphicFramePr>
+              <a:graphicFrameLocks xmlns:a="http://schemas.openxmlformats.org/drawingml/2006/main" noChangeAspect="1"/>
+            </wp:cNvGraphicFramePr>
+            <a:graphic xmlns:a="http://schemas.openxmlformats.org/drawingml/2006/main">
+              <a:graphicData uri="http://schemas.openxmlformats.org/drawingml/2006/picture">
+                <pic:pic xmlns:pic="http://schemas.openxmlformats.org/drawingml/2006/picture">
+                  <pic:nvPicPr>
+                    <pic:cNvPr id="1540196227" name=""/>
+                    <pic:cNvPicPr/>
+                  </pic:nvPicPr>
+                  <pic:blipFill>
+                    <a:blip r:embed="rId8"/>
+                    <a:stretch>
+                      <a:fillRect/>
+                    </a:stretch>
+                  </pic:blipFill>
+                  <pic:spPr>
+                    <a:xfrm>
+                      <a:off x="0" y="0"/>
+                      <a:ext cx="5943600" cy="3372485"/>
+                    </a:xfrm>
+                    <a:prstGeom prst="rect">
+                      <a:avLst/>
+                    </a:prstGeom>
+                  </pic:spPr>
+                </pic:pic>
+              </a:graphicData>
+            </a:graphic>
+          </wp:inline>
+        </w:drawing>
+      </w:r>
+    </w:p>
+    <w:p>
+      <w:pPr>
+        <w:pStyle w:val="Body"/>
+      </w:pPr>
+    </w:p>
+    <w:p>
+      <w:pPr>
+        <w:pStyle w:val="Body"/>
+      </w:pPr>
     </w:p>
     <w:p>
       <w:pPr>
@@ -4865,15 +3183,13 @@
           <w:szCs w:val="30"/>
         </w:rPr>
       </w:pPr>
-      <w:proofErr w:type="spellStart"/>
       <w:r>
         <w:rPr>
           <w:sz w:val="30"/>
           <w:szCs w:val="30"/>
         </w:rPr>
-        <w:t>i</w:t>
-      </w:r>
-      <w:proofErr w:type="spellEnd"/>
+        <w:t>j</w:t>
+      </w:r>
       <w:r>
         <w:rPr>
           <w:sz w:val="30"/>
@@ -4897,6 +3213,7 @@
         <w:pStyle w:val="Body"/>
       </w:pPr>
       <w:r>
+        <w:lastRenderedPageBreak/>
         <w:t>The following report was generated by joining rental orders, customers, employees, and gear items into a single flattened result set, where each row represents a gear item within a rental order. This report reflects how the data might appear in a spreadsheet prior to normalization.</w:t>
       </w:r>
       <w:r>
@@ -4935,7 +3252,7 @@
                     </pic:cNvPicPr>
                   </pic:nvPicPr>
                   <pic:blipFill>
-                    <a:blip r:embed="rId8"/>
+                    <a:blip r:embed="rId9"/>
                     <a:stretch>
                       <a:fillRect/>
                     </a:stretch>
@@ -4996,7 +3313,7 @@
                     </pic:cNvPicPr>
                   </pic:nvPicPr>
                   <pic:blipFill>
-                    <a:blip r:embed="rId9"/>
+                    <a:blip r:embed="rId10"/>
                     <a:stretch>
                       <a:fillRect/>
                     </a:stretch>
@@ -5046,15 +3363,7 @@
         <w:pStyle w:val="Body"/>
       </w:pPr>
       <w:r>
-        <w:t xml:space="preserve">In the sample report, order-level, customer, and employee attributes are repeated across multiple rows because each row represents a single gear item within a rental order. For example, rental order 1 appears three times, resulting in </w:t>
-      </w:r>
-      <w:proofErr w:type="gramStart"/>
-      <w:r>
-        <w:t>duplicated</w:t>
-      </w:r>
-      <w:proofErr w:type="gramEnd"/>
-      <w:r>
-        <w:t xml:space="preserve"> customer and employee data. This redundancy introduces update anomalies (e.g., a change to a customer</w:t>
+        <w:t>In the sample report, order-level, customer, and employee attributes are repeated across multiple rows because each row represents a single gear item within a rental order. For example, rental order 1 appears three times, resulting in duplicated customer and employee data. This redundancy introduces update anomalies (e.g., a change to a customer</w:t>
       </w:r>
       <w:r>
         <w:rPr>
@@ -5063,11 +3372,7 @@
         <w:t>’</w:t>
       </w:r>
       <w:r>
-        <w:t xml:space="preserve">s contact information must be applied to multiple rows), insert anomalies (new customers, gear items, or </w:t>
-      </w:r>
-      <w:r>
-        <w:lastRenderedPageBreak/>
-        <w:t>employees cannot be added independently without creating a full rental transaction), and delete anomalies (removing the final line item for an order may unintentionally remove associated order or customer information).</w:t>
+        <w:t>s contact information must be applied to multiple rows), insert anomalies (new customers, gear items, or employees cannot be added independently without creating a full rental transaction), and delete anomalies (removing the final line item for an order may unintentionally remove associated order or customer information).</w:t>
       </w:r>
     </w:p>
     <w:p>
@@ -5088,9 +3393,24 @@
           <w:sz w:val="20"/>
           <w:szCs w:val="20"/>
         </w:rPr>
-        <w:t>(</w:t>
-      </w:r>
-      <w:proofErr w:type="spellStart"/>
+        <w:t>(rental_order_id, gear_item_id)</w:t>
+      </w:r>
+      <w:r>
+        <w:t xml:space="preserve"> uniquely identifies each row. With atomic attributes and no repeating groups, the design satisfies 1NF.</w:t>
+      </w:r>
+    </w:p>
+    <w:p>
+      <w:pPr>
+        <w:pStyle w:val="Body"/>
+      </w:pPr>
+    </w:p>
+    <w:p>
+      <w:pPr>
+        <w:pStyle w:val="Body"/>
+      </w:pPr>
+      <w:r>
+        <w:t xml:space="preserve">In the 1NF design, partial dependencies existed because order-level attributes depended only on </w:t>
+      </w:r>
       <w:r>
         <w:rPr>
           <w:rFonts w:ascii="Courier New" w:hAnsi="Courier New"/>
@@ -5099,50 +3419,66 @@
         </w:rPr>
         <w:t>rental_order_id</w:t>
       </w:r>
-      <w:proofErr w:type="spellEnd"/>
-      <w:r>
-        <w:rPr>
-          <w:rFonts w:ascii="Courier New" w:hAnsi="Courier New"/>
-          <w:sz w:val="20"/>
-          <w:szCs w:val="20"/>
-        </w:rPr>
+      <w:r>
+        <w:t xml:space="preserve">, while gear attributes depended only on </w:t>
+      </w:r>
+      <w:r>
+        <w:rPr>
+          <w:rFonts w:ascii="Courier New" w:hAnsi="Courier New"/>
+          <w:sz w:val="20"/>
+          <w:szCs w:val="20"/>
+        </w:rPr>
+        <w:t>gear_item_id</w:t>
+      </w:r>
+      <w:r>
+        <w:t xml:space="preserve">. To convert the design to Second Normal Form (2NF), these partial dependencies were removed by decomposing the schema into </w:t>
+      </w:r>
+      <w:r>
+        <w:rPr>
+          <w:rFonts w:ascii="Courier New" w:hAnsi="Courier New"/>
+          <w:sz w:val="20"/>
+          <w:szCs w:val="20"/>
+        </w:rPr>
+        <w:t>rental_orders</w:t>
+      </w:r>
+      <w:r>
         <w:t xml:space="preserve">, </w:t>
       </w:r>
-      <w:proofErr w:type="spellStart"/>
-      <w:r>
-        <w:rPr>
-          <w:rFonts w:ascii="Courier New" w:hAnsi="Courier New"/>
-          <w:sz w:val="20"/>
-          <w:szCs w:val="20"/>
-        </w:rPr>
-        <w:t>gear_item_id</w:t>
-      </w:r>
-      <w:proofErr w:type="spellEnd"/>
-      <w:r>
-        <w:rPr>
-          <w:rFonts w:ascii="Courier New" w:hAnsi="Courier New"/>
-          <w:sz w:val="20"/>
-          <w:szCs w:val="20"/>
-        </w:rPr>
-        <w:t>)</w:t>
-      </w:r>
-      <w:r>
-        <w:t xml:space="preserve"> uniquely identifies each row. With atomic attributes and no repeating groups, the design satisfies 1NF.</w:t>
-      </w:r>
-    </w:p>
-    <w:p>
-      <w:pPr>
-        <w:pStyle w:val="Body"/>
-      </w:pPr>
-    </w:p>
-    <w:p>
-      <w:pPr>
-        <w:pStyle w:val="Body"/>
-      </w:pPr>
-      <w:r>
-        <w:t xml:space="preserve">In the 1NF design, partial dependencies existed because order-level attributes depended only on </w:t>
-      </w:r>
-      <w:proofErr w:type="spellStart"/>
+      <w:r>
+        <w:rPr>
+          <w:rFonts w:ascii="Courier New" w:hAnsi="Courier New"/>
+          <w:sz w:val="20"/>
+          <w:szCs w:val="20"/>
+        </w:rPr>
+        <w:t>gear_items</w:t>
+      </w:r>
+      <w:r>
+        <w:t xml:space="preserve">, and </w:t>
+      </w:r>
+      <w:r>
+        <w:rPr>
+          <w:rFonts w:ascii="Courier New" w:hAnsi="Courier New"/>
+          <w:sz w:val="20"/>
+          <w:szCs w:val="20"/>
+        </w:rPr>
+        <w:t>rental_order_items</w:t>
+      </w:r>
+      <w:r>
+        <w:t>. Each non-key attribute now depends on the entire primary key of its table.</w:t>
+      </w:r>
+    </w:p>
+    <w:p>
+      <w:pPr>
+        <w:pStyle w:val="Body"/>
+      </w:pPr>
+    </w:p>
+    <w:p>
+      <w:pPr>
+        <w:pStyle w:val="Body"/>
+      </w:pPr>
+      <w:r>
+        <w:t xml:space="preserve">Transitive dependencies were identified where customer and employee attributes depended on non-key identifiers in rental orders (e.g., </w:t>
+      </w:r>
       <w:r>
         <w:rPr>
           <w:rFonts w:ascii="Courier New" w:hAnsi="Courier New"/>
@@ -5151,85 +3487,6 @@
         </w:rPr>
         <w:t>rental_order_id</w:t>
       </w:r>
-      <w:proofErr w:type="spellEnd"/>
-      <w:r>
-        <w:t xml:space="preserve">, while gear attributes depended only on </w:t>
-      </w:r>
-      <w:proofErr w:type="spellStart"/>
-      <w:r>
-        <w:rPr>
-          <w:rFonts w:ascii="Courier New" w:hAnsi="Courier New"/>
-          <w:sz w:val="20"/>
-          <w:szCs w:val="20"/>
-        </w:rPr>
-        <w:t>gear_item_id</w:t>
-      </w:r>
-      <w:proofErr w:type="spellEnd"/>
-      <w:r>
-        <w:t xml:space="preserve">. To convert the design to Second Normal Form (2NF), these partial dependencies were removed by decomposing the schema into </w:t>
-      </w:r>
-      <w:proofErr w:type="spellStart"/>
-      <w:r>
-        <w:rPr>
-          <w:rFonts w:ascii="Courier New" w:hAnsi="Courier New"/>
-          <w:sz w:val="20"/>
-          <w:szCs w:val="20"/>
-        </w:rPr>
-        <w:t>rental_orders</w:t>
-      </w:r>
-      <w:proofErr w:type="spellEnd"/>
-      <w:r>
-        <w:t xml:space="preserve">, </w:t>
-      </w:r>
-      <w:proofErr w:type="spellStart"/>
-      <w:r>
-        <w:rPr>
-          <w:rFonts w:ascii="Courier New" w:hAnsi="Courier New"/>
-          <w:sz w:val="20"/>
-          <w:szCs w:val="20"/>
-        </w:rPr>
-        <w:t>gear_items</w:t>
-      </w:r>
-      <w:proofErr w:type="spellEnd"/>
-      <w:r>
-        <w:t xml:space="preserve">, and </w:t>
-      </w:r>
-      <w:proofErr w:type="spellStart"/>
-      <w:r>
-        <w:rPr>
-          <w:rFonts w:ascii="Courier New" w:hAnsi="Courier New"/>
-          <w:sz w:val="20"/>
-          <w:szCs w:val="20"/>
-        </w:rPr>
-        <w:t>rental_order_items</w:t>
-      </w:r>
-      <w:proofErr w:type="spellEnd"/>
-      <w:r>
-        <w:t>. Each non-key attribute now depends on the entire primary key of its table.</w:t>
-      </w:r>
-    </w:p>
-    <w:p>
-      <w:pPr>
-        <w:pStyle w:val="Body"/>
-      </w:pPr>
-    </w:p>
-    <w:p>
-      <w:pPr>
-        <w:pStyle w:val="Body"/>
-      </w:pPr>
-      <w:r>
-        <w:t xml:space="preserve">Transitive dependencies were identified where customer and employee attributes depended on non-key identifiers in rental orders (e.g., </w:t>
-      </w:r>
-      <w:proofErr w:type="spellStart"/>
-      <w:r>
-        <w:rPr>
-          <w:rFonts w:ascii="Courier New" w:hAnsi="Courier New"/>
-          <w:sz w:val="20"/>
-          <w:szCs w:val="20"/>
-        </w:rPr>
-        <w:t>rental_order_id</w:t>
-      </w:r>
-      <w:proofErr w:type="spellEnd"/>
       <w:r>
         <w:t xml:space="preserve"> </w:t>
       </w:r>
@@ -5242,7 +3499,6 @@
       <w:r>
         <w:t xml:space="preserve"> </w:t>
       </w:r>
-      <w:proofErr w:type="spellStart"/>
       <w:r>
         <w:rPr>
           <w:rFonts w:ascii="Courier New" w:hAnsi="Courier New"/>
@@ -5251,7 +3507,6 @@
         </w:rPr>
         <w:t>customer_id</w:t>
       </w:r>
-      <w:proofErr w:type="spellEnd"/>
       <w:r>
         <w:t xml:space="preserve"> </w:t>
       </w:r>
@@ -5262,23 +3517,7 @@
         <w:t>→</w:t>
       </w:r>
       <w:r>
-        <w:t xml:space="preserve"> customer attributes). These dependencies were eliminated by moving customer information into a </w:t>
-      </w:r>
-      <w:proofErr w:type="spellStart"/>
-      <w:r>
-        <w:t>customers</w:t>
-      </w:r>
-      <w:proofErr w:type="spellEnd"/>
-      <w:r>
-        <w:t xml:space="preserve"> table and employee information into an </w:t>
-      </w:r>
-      <w:proofErr w:type="spellStart"/>
-      <w:r>
-        <w:t>employees</w:t>
-      </w:r>
-      <w:proofErr w:type="spellEnd"/>
-      <w:r>
-        <w:t xml:space="preserve"> table, referenced by foreign keys. After this decomposition, all non-key attributes depend only on the primary key of their respective tables, and the schema satisfies Third Normal Form (3NF).</w:t>
+        <w:t xml:space="preserve"> customer attributes). These dependencies were eliminated by moving customer information into a customers table and employee information into an employees table, referenced by foreign keys. After this decomposition, all non-key attributes depend only on the primary key of their respective tables, and the schema satisfies Third Normal Form (3NF).</w:t>
       </w:r>
       <w:r>
         <w:rPr>
@@ -5329,7 +3568,7 @@
                     </pic:cNvPicPr>
                   </pic:nvPicPr>
                   <pic:blipFill>
-                    <a:blip r:embed="rId10"/>
+                    <a:blip r:embed="rId11"/>
                     <a:stretch>
                       <a:fillRect/>
                     </a:stretch>
@@ -5383,7 +3622,7 @@
           <w:sz w:val="30"/>
           <w:szCs w:val="30"/>
         </w:rPr>
-        <w:t>j</w:t>
+        <w:t>k</w:t>
       </w:r>
       <w:r>
         <w:rPr>
@@ -5477,7 +3716,7 @@
                     </pic:cNvPicPr>
                   </pic:nvPicPr>
                   <pic:blipFill>
-                    <a:blip r:embed="rId11"/>
+                    <a:blip r:embed="rId12"/>
                     <a:stretch>
                       <a:fillRect/>
                     </a:stretch>
@@ -5566,7 +3805,7 @@
                     </pic:cNvPicPr>
                   </pic:nvPicPr>
                   <pic:blipFill>
-                    <a:blip r:embed="rId12"/>
+                    <a:blip r:embed="rId13"/>
                     <a:stretch>
                       <a:fillRect/>
                     </a:stretch>
@@ -5644,7 +3883,7 @@
                     </pic:cNvPicPr>
                   </pic:nvPicPr>
                   <pic:blipFill>
-                    <a:blip r:embed="rId13"/>
+                    <a:blip r:embed="rId14"/>
                     <a:stretch>
                       <a:fillRect/>
                     </a:stretch>
@@ -5669,7 +3908,6 @@
           </wp:anchor>
         </w:drawing>
       </w:r>
-      <w:proofErr w:type="spellStart"/>
       <w:r>
         <w:rPr>
           <w:rFonts w:ascii="Courier New" w:hAnsi="Courier New"/>
@@ -5680,7 +3918,6 @@
         </w:rPr>
         <w:t>gear_items</w:t>
       </w:r>
-      <w:proofErr w:type="spellEnd"/>
     </w:p>
     <w:p>
       <w:pPr>
@@ -5734,7 +3971,7 @@
                     </pic:cNvPicPr>
                   </pic:nvPicPr>
                   <pic:blipFill>
-                    <a:blip r:embed="rId14"/>
+                    <a:blip r:embed="rId15"/>
                     <a:stretch>
                       <a:fillRect/>
                     </a:stretch>
@@ -5771,7 +4008,6 @@
           <w:szCs w:val="20"/>
         </w:rPr>
       </w:pPr>
-      <w:proofErr w:type="spellStart"/>
       <w:r>
         <w:rPr>
           <w:rFonts w:ascii="Courier New" w:hAnsi="Courier New"/>
@@ -5782,7 +4018,6 @@
         </w:rPr>
         <w:t>rental_orders</w:t>
       </w:r>
-      <w:proofErr w:type="spellEnd"/>
       <w:r>
         <w:rPr>
           <w:rFonts w:ascii="Courier New" w:eastAsia="Courier New" w:hAnsi="Courier New" w:cs="Courier New"/>
@@ -5824,7 +4059,7 @@
                     </pic:cNvPicPr>
                   </pic:nvPicPr>
                   <pic:blipFill>
-                    <a:blip r:embed="rId15"/>
+                    <a:blip r:embed="rId16"/>
                     <a:stretch>
                       <a:fillRect/>
                     </a:stretch>
@@ -5861,7 +4096,6 @@
           <w:szCs w:val="20"/>
         </w:rPr>
       </w:pPr>
-      <w:proofErr w:type="spellStart"/>
       <w:r>
         <w:rPr>
           <w:rFonts w:ascii="Courier New" w:hAnsi="Courier New"/>
@@ -5872,7 +4106,6 @@
         </w:rPr>
         <w:t>rental_order_items</w:t>
       </w:r>
-      <w:proofErr w:type="spellEnd"/>
     </w:p>
     <w:p>
       <w:pPr>
@@ -5914,7 +4147,7 @@
                     </pic:cNvPicPr>
                   </pic:nvPicPr>
                   <pic:blipFill>
-                    <a:blip r:embed="rId16"/>
+                    <a:blip r:embed="rId17"/>
                     <a:stretch>
                       <a:fillRect/>
                     </a:stretch>
@@ -5956,7 +4189,6 @@
           <w:szCs w:val="20"/>
         </w:rPr>
       </w:pPr>
-      <w:proofErr w:type="spellStart"/>
       <w:r>
         <w:rPr>
           <w:rFonts w:ascii="Courier New" w:hAnsi="Courier New"/>
@@ -5967,7 +4199,6 @@
         </w:rPr>
         <w:t>service_ticket_items</w:t>
       </w:r>
-      <w:proofErr w:type="spellEnd"/>
     </w:p>
     <w:p>
       <w:pPr>
@@ -6010,7 +4241,7 @@
                     </pic:cNvPicPr>
                   </pic:nvPicPr>
                   <pic:blipFill>
-                    <a:blip r:embed="rId17"/>
+                    <a:blip r:embed="rId18"/>
                     <a:stretch>
                       <a:fillRect/>
                     </a:stretch>
@@ -6044,9 +4275,6 @@
     <w:p>
       <w:pPr>
         <w:pStyle w:val="Body"/>
-      </w:pPr>
-      <w:proofErr w:type="spellStart"/>
-      <w:r>
         <w:rPr>
           <w:rFonts w:ascii="Courier New" w:hAnsi="Courier New"/>
           <w:b/>
@@ -6054,9 +4282,22 @@
           <w:sz w:val="20"/>
           <w:szCs w:val="20"/>
         </w:rPr>
+      </w:pPr>
+      <w:r>
+        <w:rPr>
+          <w:rFonts w:ascii="Courier New" w:hAnsi="Courier New"/>
+          <w:b/>
+          <w:bCs/>
+          <w:sz w:val="20"/>
+          <w:szCs w:val="20"/>
+        </w:rPr>
         <w:t>service_tickets</w:t>
       </w:r>
-      <w:proofErr w:type="spellEnd"/>
+    </w:p>
+    <w:p>
+      <w:pPr>
+        <w:pStyle w:val="Body"/>
+      </w:pPr>
       <w:r>
         <w:rPr>
           <w:rFonts w:ascii="Courier New" w:eastAsia="Courier New" w:hAnsi="Courier New" w:cs="Courier New"/>
@@ -6098,7 +4339,7 @@
                     </pic:cNvPicPr>
                   </pic:nvPicPr>
                   <pic:blipFill>
-                    <a:blip r:embed="rId18"/>
+                    <a:blip r:embed="rId19"/>
                     <a:stretch>
                       <a:fillRect/>
                     </a:stretch>
@@ -6125,8 +4366,8 @@
       </w:r>
     </w:p>
     <w:sectPr>
-      <w:headerReference w:type="default" r:id="rId19"/>
-      <w:footerReference w:type="default" r:id="rId20"/>
+      <w:headerReference w:type="default" r:id="rId20"/>
+      <w:footerReference w:type="default" r:id="rId21"/>
       <w:pgSz w:w="12240" w:h="15840"/>
       <w:pgMar w:top="1440" w:right="1440" w:bottom="1440" w:left="1440" w:header="720" w:footer="864" w:gutter="0"/>
       <w:cols w:space="720"/>
@@ -8230,7 +6471,7 @@
   <w:num w:numId="5" w16cid:durableId="670840096">
     <w:abstractNumId w:val="6"/>
     <w:lvlOverride w:ilvl="0">
-      <w:lvl w:ilvl="0" w:tplc="467EE518">
+      <w:lvl w:ilvl="0" w:tplc="1CF440DE">
         <w:start w:val="1"/>
         <w:numFmt w:val="bullet"/>
         <w:lvlText w:val="-"/>
@@ -8259,7 +6500,7 @@
       </w:lvl>
     </w:lvlOverride>
     <w:lvlOverride w:ilvl="1">
-      <w:lvl w:ilvl="1" w:tplc="8B104EAA">
+      <w:lvl w:ilvl="1" w:tplc="D3225448">
         <w:start w:val="1"/>
         <w:numFmt w:val="bullet"/>
         <w:lvlText w:val="-"/>
@@ -8288,7 +6529,7 @@
       </w:lvl>
     </w:lvlOverride>
     <w:lvlOverride w:ilvl="2">
-      <w:lvl w:ilvl="2" w:tplc="420AD752">
+      <w:lvl w:ilvl="2" w:tplc="C92AC43C">
         <w:start w:val="1"/>
         <w:numFmt w:val="bullet"/>
         <w:lvlText w:val="-"/>
@@ -8317,7 +6558,7 @@
       </w:lvl>
     </w:lvlOverride>
     <w:lvlOverride w:ilvl="3">
-      <w:lvl w:ilvl="3" w:tplc="FB3022CC">
+      <w:lvl w:ilvl="3" w:tplc="B02E42BA">
         <w:start w:val="1"/>
         <w:numFmt w:val="bullet"/>
         <w:lvlText w:val="-"/>
@@ -8346,7 +6587,7 @@
       </w:lvl>
     </w:lvlOverride>
     <w:lvlOverride w:ilvl="4">
-      <w:lvl w:ilvl="4" w:tplc="45E24CD8">
+      <w:lvl w:ilvl="4" w:tplc="6B72754C">
         <w:start w:val="1"/>
         <w:numFmt w:val="bullet"/>
         <w:lvlText w:val="-"/>
@@ -8375,7 +6616,7 @@
       </w:lvl>
     </w:lvlOverride>
     <w:lvlOverride w:ilvl="5">
-      <w:lvl w:ilvl="5" w:tplc="6FF80874">
+      <w:lvl w:ilvl="5" w:tplc="73FA9A7A">
         <w:start w:val="1"/>
         <w:numFmt w:val="bullet"/>
         <w:lvlText w:val="-"/>
@@ -8404,7 +6645,7 @@
       </w:lvl>
     </w:lvlOverride>
     <w:lvlOverride w:ilvl="6">
-      <w:lvl w:ilvl="6" w:tplc="CC685A00">
+      <w:lvl w:ilvl="6" w:tplc="ABB850D0">
         <w:start w:val="1"/>
         <w:numFmt w:val="bullet"/>
         <w:lvlText w:val="-"/>
@@ -8433,7 +6674,7 @@
       </w:lvl>
     </w:lvlOverride>
     <w:lvlOverride w:ilvl="7">
-      <w:lvl w:ilvl="7" w:tplc="26CE19B0">
+      <w:lvl w:ilvl="7" w:tplc="BA7CD52A">
         <w:start w:val="1"/>
         <w:numFmt w:val="bullet"/>
         <w:lvlText w:val="-"/>
@@ -8462,7 +6703,7 @@
       </w:lvl>
     </w:lvlOverride>
     <w:lvlOverride w:ilvl="8">
-      <w:lvl w:ilvl="8" w:tplc="E7DA3372">
+      <w:lvl w:ilvl="8" w:tplc="61C2A2E0">
         <w:start w:val="1"/>
         <w:numFmt w:val="bullet"/>
         <w:lvlText w:val="-"/>
@@ -8500,7 +6741,7 @@
   <w:num w:numId="7" w16cid:durableId="2110466566">
     <w:abstractNumId w:val="6"/>
     <w:lvlOverride w:ilvl="0">
-      <w:lvl w:ilvl="0" w:tplc="467EE518">
+      <w:lvl w:ilvl="0" w:tplc="1CF440DE">
         <w:start w:val="1"/>
         <w:numFmt w:val="bullet"/>
         <w:lvlText w:val="-"/>
@@ -8529,7 +6770,7 @@
       </w:lvl>
     </w:lvlOverride>
     <w:lvlOverride w:ilvl="1">
-      <w:lvl w:ilvl="1" w:tplc="8B104EAA">
+      <w:lvl w:ilvl="1" w:tplc="D3225448">
         <w:start w:val="1"/>
         <w:numFmt w:val="bullet"/>
         <w:lvlText w:val="-"/>
@@ -8558,7 +6799,7 @@
       </w:lvl>
     </w:lvlOverride>
     <w:lvlOverride w:ilvl="2">
-      <w:lvl w:ilvl="2" w:tplc="420AD752">
+      <w:lvl w:ilvl="2" w:tplc="C92AC43C">
         <w:start w:val="1"/>
         <w:numFmt w:val="bullet"/>
         <w:lvlText w:val="-"/>
@@ -8587,7 +6828,7 @@
       </w:lvl>
     </w:lvlOverride>
     <w:lvlOverride w:ilvl="3">
-      <w:lvl w:ilvl="3" w:tplc="FB3022CC">
+      <w:lvl w:ilvl="3" w:tplc="B02E42BA">
         <w:start w:val="1"/>
         <w:numFmt w:val="bullet"/>
         <w:lvlText w:val="-"/>
@@ -8616,7 +6857,7 @@
       </w:lvl>
     </w:lvlOverride>
     <w:lvlOverride w:ilvl="4">
-      <w:lvl w:ilvl="4" w:tplc="45E24CD8">
+      <w:lvl w:ilvl="4" w:tplc="6B72754C">
         <w:start w:val="1"/>
         <w:numFmt w:val="bullet"/>
         <w:lvlText w:val="-"/>
@@ -8645,7 +6886,7 @@
       </w:lvl>
     </w:lvlOverride>
     <w:lvlOverride w:ilvl="5">
-      <w:lvl w:ilvl="5" w:tplc="6FF80874">
+      <w:lvl w:ilvl="5" w:tplc="73FA9A7A">
         <w:start w:val="1"/>
         <w:numFmt w:val="bullet"/>
         <w:lvlText w:val="-"/>
@@ -8674,7 +6915,7 @@
       </w:lvl>
     </w:lvlOverride>
     <w:lvlOverride w:ilvl="6">
-      <w:lvl w:ilvl="6" w:tplc="CC685A00">
+      <w:lvl w:ilvl="6" w:tplc="ABB850D0">
         <w:start w:val="1"/>
         <w:numFmt w:val="bullet"/>
         <w:lvlText w:val="-"/>
@@ -8703,7 +6944,7 @@
       </w:lvl>
     </w:lvlOverride>
     <w:lvlOverride w:ilvl="7">
-      <w:lvl w:ilvl="7" w:tplc="26CE19B0">
+      <w:lvl w:ilvl="7" w:tplc="BA7CD52A">
         <w:start w:val="1"/>
         <w:numFmt w:val="bullet"/>
         <w:lvlText w:val="-"/>
@@ -8732,7 +6973,7 @@
       </w:lvl>
     </w:lvlOverride>
     <w:lvlOverride w:ilvl="8">
-      <w:lvl w:ilvl="8" w:tplc="E7DA3372">
+      <w:lvl w:ilvl="8" w:tplc="61C2A2E0">
         <w:start w:val="1"/>
         <w:numFmt w:val="bullet"/>
         <w:lvlText w:val="-"/>
@@ -8785,7 +7026,7 @@
   <w:num w:numId="12" w16cid:durableId="1618024880">
     <w:abstractNumId w:val="6"/>
     <w:lvlOverride w:ilvl="0">
-      <w:lvl w:ilvl="0" w:tplc="467EE518">
+      <w:lvl w:ilvl="0" w:tplc="1CF440DE">
         <w:start w:val="1"/>
         <w:numFmt w:val="bullet"/>
         <w:lvlText w:val="-"/>
@@ -8814,7 +7055,7 @@
       </w:lvl>
     </w:lvlOverride>
     <w:lvlOverride w:ilvl="1">
-      <w:lvl w:ilvl="1" w:tplc="8B104EAA">
+      <w:lvl w:ilvl="1" w:tplc="D3225448">
         <w:start w:val="1"/>
         <w:numFmt w:val="bullet"/>
         <w:lvlText w:val="-"/>
@@ -8843,7 +7084,7 @@
       </w:lvl>
     </w:lvlOverride>
     <w:lvlOverride w:ilvl="2">
-      <w:lvl w:ilvl="2" w:tplc="420AD752">
+      <w:lvl w:ilvl="2" w:tplc="C92AC43C">
         <w:start w:val="1"/>
         <w:numFmt w:val="bullet"/>
         <w:lvlText w:val="-"/>
@@ -8872,7 +7113,7 @@
       </w:lvl>
     </w:lvlOverride>
     <w:lvlOverride w:ilvl="3">
-      <w:lvl w:ilvl="3" w:tplc="FB3022CC">
+      <w:lvl w:ilvl="3" w:tplc="B02E42BA">
         <w:start w:val="1"/>
         <w:numFmt w:val="bullet"/>
         <w:lvlText w:val="-"/>
@@ -8901,7 +7142,7 @@
       </w:lvl>
     </w:lvlOverride>
     <w:lvlOverride w:ilvl="4">
-      <w:lvl w:ilvl="4" w:tplc="45E24CD8">
+      <w:lvl w:ilvl="4" w:tplc="6B72754C">
         <w:start w:val="1"/>
         <w:numFmt w:val="bullet"/>
         <w:lvlText w:val="-"/>
@@ -8930,7 +7171,7 @@
       </w:lvl>
     </w:lvlOverride>
     <w:lvlOverride w:ilvl="5">
-      <w:lvl w:ilvl="5" w:tplc="6FF80874">
+      <w:lvl w:ilvl="5" w:tplc="73FA9A7A">
         <w:start w:val="1"/>
         <w:numFmt w:val="bullet"/>
         <w:lvlText w:val="-"/>
@@ -8959,7 +7200,7 @@
       </w:lvl>
     </w:lvlOverride>
     <w:lvlOverride w:ilvl="6">
-      <w:lvl w:ilvl="6" w:tplc="CC685A00">
+      <w:lvl w:ilvl="6" w:tplc="ABB850D0">
         <w:start w:val="1"/>
         <w:numFmt w:val="bullet"/>
         <w:lvlText w:val="-"/>
@@ -8988,7 +7229,7 @@
       </w:lvl>
     </w:lvlOverride>
     <w:lvlOverride w:ilvl="7">
-      <w:lvl w:ilvl="7" w:tplc="26CE19B0">
+      <w:lvl w:ilvl="7" w:tplc="BA7CD52A">
         <w:start w:val="1"/>
         <w:numFmt w:val="bullet"/>
         <w:lvlText w:val="-"/>
@@ -9017,7 +7258,7 @@
       </w:lvl>
     </w:lvlOverride>
     <w:lvlOverride w:ilvl="8">
-      <w:lvl w:ilvl="8" w:tplc="E7DA3372">
+      <w:lvl w:ilvl="8" w:tplc="61C2A2E0">
         <w:start w:val="1"/>
         <w:numFmt w:val="bullet"/>
         <w:lvlText w:val="-"/>
@@ -9557,6 +7798,7 @@
   <w:style w:type="character" w:default="1" w:styleId="DefaultParagraphFont">
     <w:name w:val="Default Paragraph Font"/>
     <w:uiPriority w:val="1"/>
+    <w:semiHidden/>
     <w:unhideWhenUsed/>
   </w:style>
   <w:style w:type="table" w:default="1" w:styleId="TableNormal">
@@ -9660,6 +7902,17 @@
       <w:sz w:val="32"/>
       <w:szCs w:val="32"/>
     </w:rPr>
+  </w:style>
+  <w:style w:type="paragraph" w:styleId="ListParagraph">
+    <w:name w:val="List Paragraph"/>
+    <w:basedOn w:val="Normal"/>
+    <w:uiPriority w:val="34"/>
+    <w:qFormat/>
+    <w:rsid w:val="00657BA7"/>
+    <w:pPr>
+      <w:ind w:left="720"/>
+      <w:contextualSpacing/>
+    </w:pPr>
   </w:style>
 </w:styles>
 </file>

</xml_diff>